<commit_message>
fix: run_all fig3 -> full-sample grid (matches notebook fig3 & all materials); PPT rebuilt p14; case report embeds canonical figs+calibration table
</commit_message>
<xml_diff>
--- a/teaching_doc/案例报告.docx
+++ b/teaching_doc/案例报告.docx
@@ -1703,8 +1703,361 @@
           <w:b w:val="0"/>
           <w:sz w:val="24"/>
         </w:rPr>
-        <w:t>：[0.5,0.6) 桶 58.3%（446 条）、[0.6,0.7) 桶 50.9%（709 条）、[0.7,0.8) 桶 54.3%（746 条）、[0.8,0.9) 桶 54.1%（712 条）、[0.9,1.0) 桶 54.0%（4214 条，占 61%）。</w:t>
+        <w:t>：</w:t>
       </w:r>
+    </w:p>
+    <w:p>
+      <w:pPr>
+        <w:spacing w:before="120" w:after="60"/>
+      </w:pPr>
+      <w:r>
+        <w:rPr>
+          <w:rFonts w:ascii="Times New Roman" w:hAnsi="Times New Roman" w:eastAsia="黑体"/>
+          <w:b/>
+          <w:color w:val="1D4ED8"/>
+          <w:sz w:val="21"/>
+        </w:rPr>
+        <w:t>表 1　置信度校准分桶（全样本；其余 83 条信号置信度低于 0.5，不在分桶内）</w:t>
+      </w:r>
+    </w:p>
+    <w:tbl>
+      <w:tblPr>
+        <w:tblStyle w:val="TableGrid"/>
+        <w:tblW w:type="auto" w:w="0"/>
+        <w:jc w:val="center"/>
+        <w:tblLook w:firstColumn="1" w:firstRow="1" w:lastColumn="0" w:lastRow="0" w:noHBand="0" w:noVBand="1" w:val="04A0"/>
+      </w:tblPr>
+      <w:tblGrid>
+        <w:gridCol w:w="1662"/>
+        <w:gridCol w:w="1662"/>
+        <w:gridCol w:w="1662"/>
+        <w:gridCol w:w="1662"/>
+        <w:gridCol w:w="1662"/>
+        <w:gridCol w:w="1662"/>
+      </w:tblGrid>
+      <w:tr>
+        <w:tc>
+          <w:tcPr>
+            <w:tcW w:type="dxa" w:w="2041"/>
+            <w:shd w:val="clear" w:color="auto" w:fill="E2E8F0"/>
+          </w:tcPr>
+          <w:p>
+            <w:pPr>
+              <w:jc w:val="center"/>
+            </w:pPr>
+            <w:r/>
+            <w:r>
+              <w:rPr>
+                <w:rFonts w:ascii="Times New Roman" w:hAnsi="Times New Roman" w:eastAsia="黑体"/>
+                <w:b/>
+                <w:sz w:val="20"/>
+              </w:rPr>
+              <w:t>置信度桶</w:t>
+            </w:r>
+          </w:p>
+        </w:tc>
+        <w:tc>
+          <w:tcPr>
+            <w:tcW w:type="dxa" w:w="1361"/>
+            <w:shd w:val="clear" w:color="auto" w:fill="E2E8F0"/>
+          </w:tcPr>
+          <w:p>
+            <w:pPr>
+              <w:jc w:val="center"/>
+            </w:pPr>
+            <w:r/>
+            <w:r>
+              <w:rPr>
+                <w:rFonts w:ascii="Times New Roman" w:hAnsi="Times New Roman" w:eastAsia="黑体"/>
+                <w:b/>
+                <w:sz w:val="20"/>
+              </w:rPr>
+              <w:t>[0.5,0.6)</w:t>
+            </w:r>
+          </w:p>
+        </w:tc>
+        <w:tc>
+          <w:tcPr>
+            <w:tcW w:type="dxa" w:w="1361"/>
+            <w:shd w:val="clear" w:color="auto" w:fill="E2E8F0"/>
+          </w:tcPr>
+          <w:p>
+            <w:pPr>
+              <w:jc w:val="center"/>
+            </w:pPr>
+            <w:r/>
+            <w:r>
+              <w:rPr>
+                <w:rFonts w:ascii="Times New Roman" w:hAnsi="Times New Roman" w:eastAsia="黑体"/>
+                <w:b/>
+                <w:sz w:val="20"/>
+              </w:rPr>
+              <w:t>[0.6,0.7)</w:t>
+            </w:r>
+          </w:p>
+        </w:tc>
+        <w:tc>
+          <w:tcPr>
+            <w:tcW w:type="dxa" w:w="1361"/>
+            <w:shd w:val="clear" w:color="auto" w:fill="E2E8F0"/>
+          </w:tcPr>
+          <w:p>
+            <w:pPr>
+              <w:jc w:val="center"/>
+            </w:pPr>
+            <w:r/>
+            <w:r>
+              <w:rPr>
+                <w:rFonts w:ascii="Times New Roman" w:hAnsi="Times New Roman" w:eastAsia="黑体"/>
+                <w:b/>
+                <w:sz w:val="20"/>
+              </w:rPr>
+              <w:t>[0.7,0.8)</w:t>
+            </w:r>
+          </w:p>
+        </w:tc>
+        <w:tc>
+          <w:tcPr>
+            <w:tcW w:type="dxa" w:w="1361"/>
+            <w:shd w:val="clear" w:color="auto" w:fill="E2E8F0"/>
+          </w:tcPr>
+          <w:p>
+            <w:pPr>
+              <w:jc w:val="center"/>
+            </w:pPr>
+            <w:r/>
+            <w:r>
+              <w:rPr>
+                <w:rFonts w:ascii="Times New Roman" w:hAnsi="Times New Roman" w:eastAsia="黑体"/>
+                <w:b/>
+                <w:sz w:val="20"/>
+              </w:rPr>
+              <w:t>[0.8,0.9)</w:t>
+            </w:r>
+          </w:p>
+        </w:tc>
+        <w:tc>
+          <w:tcPr>
+            <w:tcW w:type="dxa" w:w="1701"/>
+            <w:shd w:val="clear" w:color="auto" w:fill="E2E8F0"/>
+          </w:tcPr>
+          <w:p>
+            <w:pPr>
+              <w:jc w:val="center"/>
+            </w:pPr>
+            <w:r/>
+            <w:r>
+              <w:rPr>
+                <w:rFonts w:ascii="Times New Roman" w:hAnsi="Times New Roman" w:eastAsia="黑体"/>
+                <w:b/>
+                <w:sz w:val="20"/>
+              </w:rPr>
+              <w:t>[0.9,1.0)</w:t>
+            </w:r>
+          </w:p>
+        </w:tc>
+      </w:tr>
+      <w:tr>
+        <w:tc>
+          <w:tcPr>
+            <w:tcW w:type="dxa" w:w="2041"/>
+          </w:tcPr>
+          <w:p>
+            <w:r/>
+            <w:r>
+              <w:rPr>
+                <w:rFonts w:ascii="Times New Roman" w:hAnsi="Times New Roman" w:eastAsia="宋体"/>
+                <w:b w:val="0"/>
+                <w:sz w:val="20"/>
+              </w:rPr>
+              <w:t>信号数</w:t>
+            </w:r>
+          </w:p>
+        </w:tc>
+        <w:tc>
+          <w:tcPr>
+            <w:tcW w:type="dxa" w:w="1361"/>
+          </w:tcPr>
+          <w:p>
+            <w:r/>
+            <w:r>
+              <w:rPr>
+                <w:rFonts w:ascii="Times New Roman" w:hAnsi="Times New Roman" w:eastAsia="宋体"/>
+                <w:b w:val="0"/>
+                <w:sz w:val="20"/>
+              </w:rPr>
+              <w:t>446</w:t>
+            </w:r>
+          </w:p>
+        </w:tc>
+        <w:tc>
+          <w:tcPr>
+            <w:tcW w:type="dxa" w:w="1361"/>
+          </w:tcPr>
+          <w:p>
+            <w:r/>
+            <w:r>
+              <w:rPr>
+                <w:rFonts w:ascii="Times New Roman" w:hAnsi="Times New Roman" w:eastAsia="宋体"/>
+                <w:b w:val="0"/>
+                <w:sz w:val="20"/>
+              </w:rPr>
+              <w:t>709</w:t>
+            </w:r>
+          </w:p>
+        </w:tc>
+        <w:tc>
+          <w:tcPr>
+            <w:tcW w:type="dxa" w:w="1361"/>
+          </w:tcPr>
+          <w:p>
+            <w:r/>
+            <w:r>
+              <w:rPr>
+                <w:rFonts w:ascii="Times New Roman" w:hAnsi="Times New Roman" w:eastAsia="宋体"/>
+                <w:b w:val="0"/>
+                <w:sz w:val="20"/>
+              </w:rPr>
+              <w:t>746</w:t>
+            </w:r>
+          </w:p>
+        </w:tc>
+        <w:tc>
+          <w:tcPr>
+            <w:tcW w:type="dxa" w:w="1361"/>
+          </w:tcPr>
+          <w:p>
+            <w:r/>
+            <w:r>
+              <w:rPr>
+                <w:rFonts w:ascii="Times New Roman" w:hAnsi="Times New Roman" w:eastAsia="宋体"/>
+                <w:b w:val="0"/>
+                <w:sz w:val="20"/>
+              </w:rPr>
+              <w:t>712</w:t>
+            </w:r>
+          </w:p>
+        </w:tc>
+        <w:tc>
+          <w:tcPr>
+            <w:tcW w:type="dxa" w:w="1701"/>
+          </w:tcPr>
+          <w:p>
+            <w:r/>
+            <w:r>
+              <w:rPr>
+                <w:rFonts w:ascii="Times New Roman" w:hAnsi="Times New Roman" w:eastAsia="宋体"/>
+                <w:b w:val="0"/>
+                <w:sz w:val="20"/>
+              </w:rPr>
+              <w:t>4214（占 61%）</w:t>
+            </w:r>
+          </w:p>
+        </w:tc>
+      </w:tr>
+      <w:tr>
+        <w:tc>
+          <w:tcPr>
+            <w:tcW w:type="dxa" w:w="2041"/>
+          </w:tcPr>
+          <w:p>
+            <w:r/>
+            <w:r>
+              <w:rPr>
+                <w:rFonts w:ascii="Times New Roman" w:hAnsi="Times New Roman" w:eastAsia="宋体"/>
+                <w:b w:val="0"/>
+                <w:sz w:val="20"/>
+              </w:rPr>
+              <w:t>真实方向命中率</w:t>
+            </w:r>
+          </w:p>
+        </w:tc>
+        <w:tc>
+          <w:tcPr>
+            <w:tcW w:type="dxa" w:w="1361"/>
+          </w:tcPr>
+          <w:p>
+            <w:r/>
+            <w:r>
+              <w:rPr>
+                <w:rFonts w:ascii="Times New Roman" w:hAnsi="Times New Roman" w:eastAsia="宋体"/>
+                <w:b w:val="0"/>
+                <w:sz w:val="20"/>
+              </w:rPr>
+              <w:t>58.3%</w:t>
+            </w:r>
+          </w:p>
+        </w:tc>
+        <w:tc>
+          <w:tcPr>
+            <w:tcW w:type="dxa" w:w="1361"/>
+          </w:tcPr>
+          <w:p>
+            <w:r/>
+            <w:r>
+              <w:rPr>
+                <w:rFonts w:ascii="Times New Roman" w:hAnsi="Times New Roman" w:eastAsia="宋体"/>
+                <w:b w:val="0"/>
+                <w:sz w:val="20"/>
+              </w:rPr>
+              <w:t>50.9%</w:t>
+            </w:r>
+          </w:p>
+        </w:tc>
+        <w:tc>
+          <w:tcPr>
+            <w:tcW w:type="dxa" w:w="1361"/>
+          </w:tcPr>
+          <w:p>
+            <w:r/>
+            <w:r>
+              <w:rPr>
+                <w:rFonts w:ascii="Times New Roman" w:hAnsi="Times New Roman" w:eastAsia="宋体"/>
+                <w:b w:val="0"/>
+                <w:sz w:val="20"/>
+              </w:rPr>
+              <w:t>54.3%</w:t>
+            </w:r>
+          </w:p>
+        </w:tc>
+        <w:tc>
+          <w:tcPr>
+            <w:tcW w:type="dxa" w:w="1361"/>
+          </w:tcPr>
+          <w:p>
+            <w:r/>
+            <w:r>
+              <w:rPr>
+                <w:rFonts w:ascii="Times New Roman" w:hAnsi="Times New Roman" w:eastAsia="宋体"/>
+                <w:b w:val="0"/>
+                <w:sz w:val="20"/>
+              </w:rPr>
+              <w:t>54.1%</w:t>
+            </w:r>
+          </w:p>
+        </w:tc>
+        <w:tc>
+          <w:tcPr>
+            <w:tcW w:type="dxa" w:w="1701"/>
+          </w:tcPr>
+          <w:p>
+            <w:r/>
+            <w:r>
+              <w:rPr>
+                <w:rFonts w:ascii="Times New Roman" w:hAnsi="Times New Roman" w:eastAsia="宋体"/>
+                <w:b w:val="0"/>
+                <w:sz w:val="20"/>
+              </w:rPr>
+              <w:t>54.0%</w:t>
+            </w:r>
+          </w:p>
+        </w:tc>
+      </w:tr>
+    </w:tbl>
+    <w:p>
+      <w:pPr>
+        <w:spacing w:after="40"/>
+      </w:pPr>
     </w:p>
     <w:p>
       <w:pPr>
@@ -2381,6 +2734,61 @@
     </w:p>
     <w:p>
       <w:pPr>
+        <w:spacing w:before="120" w:after="40"/>
+        <w:jc w:val="center"/>
+      </w:pPr>
+      <w:r>
+        <w:drawing>
+          <wp:inline xmlns:a="http://schemas.openxmlformats.org/drawingml/2006/main" xmlns:pic="http://schemas.openxmlformats.org/drawingml/2006/picture">
+            <wp:extent cx="5616000" cy="2918117"/>
+            <wp:docPr id="1" name="Picture 1"/>
+            <wp:cNvGraphicFramePr>
+              <a:graphicFrameLocks noChangeAspect="1"/>
+            </wp:cNvGraphicFramePr>
+            <a:graphic>
+              <a:graphicData uri="http://schemas.openxmlformats.org/drawingml/2006/picture">
+                <pic:pic>
+                  <pic:nvPicPr>
+                    <pic:cNvPr id="0" name="report_fig1_nav.png"/>
+                    <pic:cNvPicPr/>
+                  </pic:nvPicPr>
+                  <pic:blipFill>
+                    <a:blip r:embed="rId9"/>
+                    <a:stretch>
+                      <a:fillRect/>
+                    </a:stretch>
+                  </pic:blipFill>
+                  <pic:spPr>
+                    <a:xfrm>
+                      <a:off x="0" y="0"/>
+                      <a:ext cx="5616000" cy="2918117"/>
+                    </a:xfrm>
+                    <a:prstGeom prst="rect"/>
+                  </pic:spPr>
+                </pic:pic>
+              </a:graphicData>
+            </a:graphic>
+          </wp:inline>
+        </w:drawing>
+      </w:r>
+    </w:p>
+    <w:p>
+      <w:pPr>
+        <w:spacing w:after="160"/>
+        <w:jc w:val="center"/>
+      </w:pPr>
+      <w:r>
+        <w:rPr>
+          <w:rFonts w:ascii="Times New Roman" w:hAnsi="Times New Roman" w:eastAsia="黑体"/>
+          <w:b w:val="0"/>
+          <w:color w:val="475569"/>
+          <w:sz w:val="20"/>
+        </w:rPr>
+        <w:t>图 1　固定 AI 信号、不同仓位规则下的组合累计净值（虚线为样本外起点；数据截至 2025-10-28）</w:t>
+      </w:r>
+    </w:p>
+    <w:p>
+      <w:pPr>
         <w:spacing w:before="200" w:after="80"/>
       </w:pPr>
       <w:r>
@@ -2474,6 +2882,61 @@
           <w:sz w:val="25"/>
         </w:rPr>
         <w:t>牛市里嫌它贵、回撤来临时谢它还在的风险预算，是账户里真正的安全带——保费看得见的年份，恰是它最便宜的年份。</w:t>
+      </w:r>
+    </w:p>
+    <w:p>
+      <w:pPr>
+        <w:spacing w:before="120" w:after="40"/>
+        <w:jc w:val="center"/>
+      </w:pPr>
+      <w:r>
+        <w:drawing>
+          <wp:inline xmlns:a="http://schemas.openxmlformats.org/drawingml/2006/main" xmlns:pic="http://schemas.openxmlformats.org/drawingml/2006/picture">
+            <wp:extent cx="5616000" cy="2419200"/>
+            <wp:docPr id="2" name="Picture 2"/>
+            <wp:cNvGraphicFramePr>
+              <a:graphicFrameLocks noChangeAspect="1"/>
+            </wp:cNvGraphicFramePr>
+            <a:graphic>
+              <a:graphicData uri="http://schemas.openxmlformats.org/drawingml/2006/picture">
+                <pic:pic>
+                  <pic:nvPicPr>
+                    <pic:cNvPr id="0" name="report_fig2_dd.png"/>
+                    <pic:cNvPicPr/>
+                  </pic:nvPicPr>
+                  <pic:blipFill>
+                    <a:blip r:embed="rId10"/>
+                    <a:stretch>
+                      <a:fillRect/>
+                    </a:stretch>
+                  </pic:blipFill>
+                  <pic:spPr>
+                    <a:xfrm>
+                      <a:off x="0" y="0"/>
+                      <a:ext cx="5616000" cy="2419200"/>
+                    </a:xfrm>
+                    <a:prstGeom prst="rect"/>
+                  </pic:spPr>
+                </pic:pic>
+              </a:graphicData>
+            </a:graphic>
+          </wp:inline>
+        </w:drawing>
+      </w:r>
+    </w:p>
+    <w:p>
+      <w:pPr>
+        <w:spacing w:after="160"/>
+        <w:jc w:val="center"/>
+      </w:pPr>
+      <w:r>
+        <w:rPr>
+          <w:rFonts w:ascii="Times New Roman" w:hAnsi="Times New Roman" w:eastAsia="黑体"/>
+          <w:b w:val="0"/>
+          <w:color w:val="475569"/>
+          <w:sz w:val="20"/>
+        </w:rPr>
+        <w:t>图 2　三组组合回撤曲线与 -6% 风险预算干预线（数据截至 2025-10-28）</w:t>
       </w:r>
     </w:p>
     <w:p>
@@ -3011,6 +3474,61 @@
     </w:p>
     <w:p>
       <w:pPr>
+        <w:spacing w:before="120" w:after="40"/>
+        <w:jc w:val="center"/>
+      </w:pPr>
+      <w:r>
+        <w:drawing>
+          <wp:inline xmlns:a="http://schemas.openxmlformats.org/drawingml/2006/main" xmlns:pic="http://schemas.openxmlformats.org/drawingml/2006/picture">
+            <wp:extent cx="5616000" cy="2608914"/>
+            <wp:docPr id="3" name="Picture 3"/>
+            <wp:cNvGraphicFramePr>
+              <a:graphicFrameLocks noChangeAspect="1"/>
+            </wp:cNvGraphicFramePr>
+            <a:graphic>
+              <a:graphicData uri="http://schemas.openxmlformats.org/drawingml/2006/picture">
+                <pic:pic>
+                  <pic:nvPicPr>
+                    <pic:cNvPr id="0" name="report_fig3_sens.png"/>
+                    <pic:cNvPicPr/>
+                  </pic:nvPicPr>
+                  <pic:blipFill>
+                    <a:blip r:embed="rId11"/>
+                    <a:stretch>
+                      <a:fillRect/>
+                    </a:stretch>
+                  </pic:blipFill>
+                  <pic:spPr>
+                    <a:xfrm>
+                      <a:off x="0" y="0"/>
+                      <a:ext cx="5616000" cy="2608914"/>
+                    </a:xfrm>
+                    <a:prstGeom prst="rect"/>
+                  </pic:spPr>
+                </pic:pic>
+              </a:graphicData>
+            </a:graphic>
+          </wp:inline>
+        </w:drawing>
+      </w:r>
+    </w:p>
+    <w:p>
+      <w:pPr>
+        <w:spacing w:after="160"/>
+        <w:jc w:val="center"/>
+      </w:pPr>
+      <w:r>
+        <w:rPr>
+          <w:rFonts w:ascii="Times New Roman" w:hAnsi="Times New Roman" w:eastAsia="黑体"/>
+          <w:b w:val="0"/>
+          <w:color w:val="475569"/>
+          <w:sz w:val="20"/>
+        </w:rPr>
+        <w:t>图 3　仓位规模敏感性：凯利缩放系数 × 回撤干预（全样本，含反事实情形；数据截至 2025-10-28）</w:t>
+      </w:r>
+    </w:p>
+    <w:p>
+      <w:pPr>
         <w:spacing w:before="360" w:after="160"/>
         <w:pBdr>
           <w:bottom w:val="single" w:sz="12" w:space="2" w:color="0F172A"/>

</xml_diff>

<commit_message>
V6: lecture-palette figures (fig1-5) incl cost-scan inversion & calibration curve; 4.8 signal-decay analysis (53.95%->49.8%); report synced
</commit_message>
<xml_diff>
--- a/teaching_doc/案例报告.docx
+++ b/teaching_doc/案例报告.docx
@@ -2005,7 +2005,7 @@
       <w:r>
         <w:drawing>
           <wp:inline xmlns:a="http://schemas.openxmlformats.org/drawingml/2006/main" xmlns:pic="http://schemas.openxmlformats.org/drawingml/2006/picture">
-            <wp:extent cx="5472000" cy="2843294"/>
+            <wp:extent cx="5472000" cy="2846154"/>
             <wp:docPr id="1" name="Picture 1"/>
             <wp:cNvGraphicFramePr>
               <a:graphicFrameLocks noChangeAspect="1"/>
@@ -2026,7 +2026,7 @@
                   <pic:spPr>
                     <a:xfrm>
                       <a:off x="0" y="0"/>
-                      <a:ext cx="5472000" cy="2843294"/>
+                      <a:ext cx="5472000" cy="2846154"/>
                     </a:xfrm>
                     <a:prstGeom prst="rect"/>
                   </pic:spPr>
@@ -2086,7 +2086,7 @@
       <w:r>
         <w:drawing>
           <wp:inline xmlns:a="http://schemas.openxmlformats.org/drawingml/2006/main" xmlns:pic="http://schemas.openxmlformats.org/drawingml/2006/picture">
-            <wp:extent cx="5472000" cy="2357169"/>
+            <wp:extent cx="5472000" cy="2369195"/>
             <wp:docPr id="2" name="Picture 2"/>
             <wp:cNvGraphicFramePr>
               <a:graphicFrameLocks noChangeAspect="1"/>
@@ -2107,7 +2107,7 @@
                   <pic:spPr>
                     <a:xfrm>
                       <a:off x="0" y="0"/>
-                      <a:ext cx="5472000" cy="2357169"/>
+                      <a:ext cx="5472000" cy="2369195"/>
                     </a:xfrm>
                     <a:prstGeom prst="rect"/>
                   </pic:spPr>
@@ -2708,7 +2708,7 @@
       <w:r>
         <w:drawing>
           <wp:inline xmlns:a="http://schemas.openxmlformats.org/drawingml/2006/main" xmlns:pic="http://schemas.openxmlformats.org/drawingml/2006/picture">
-            <wp:extent cx="5472000" cy="2542019"/>
+            <wp:extent cx="5472000" cy="2551710"/>
             <wp:docPr id="3" name="Picture 3"/>
             <wp:cNvGraphicFramePr>
               <a:graphicFrameLocks noChangeAspect="1"/>
@@ -2729,7 +2729,7 @@
                   <pic:spPr>
                     <a:xfrm>
                       <a:off x="0" y="0"/>
-                      <a:ext cx="5472000" cy="2542019"/>
+                      <a:ext cx="5472000" cy="2551710"/>
                     </a:xfrm>
                     <a:prstGeom prst="rect"/>
                   </pic:spPr>
@@ -3561,6 +3561,60 @@
           <w:sz w:val="24"/>
         </w:rPr>
         <w:t>。其二，成本每翻一倍，A、B 组夏普近乎腰斩，C 组只温和下降——低换手规则对成本参数的敏感度显著更低，仓位规则的选择本质上是换手率预算的选择。其三，评估任何“AI 信号 → 仓位”方案，必须报告结论对成本参数的稳健性。0 与 10bp 是机制实验的极端情形，不代表现实报价。</w:t>
+      </w:r>
+    </w:p>
+    <w:p>
+      <w:pPr>
+        <w:spacing w:before="120" w:after="40"/>
+        <w:jc w:val="center"/>
+      </w:pPr>
+      <w:r>
+        <w:drawing>
+          <wp:inline xmlns:a="http://schemas.openxmlformats.org/drawingml/2006/main" xmlns:pic="http://schemas.openxmlformats.org/drawingml/2006/picture">
+            <wp:extent cx="5472000" cy="2647742"/>
+            <wp:docPr id="4" name="Picture 4"/>
+            <wp:cNvGraphicFramePr>
+              <a:graphicFrameLocks noChangeAspect="1"/>
+            </wp:cNvGraphicFramePr>
+            <a:graphic>
+              <a:graphicData uri="http://schemas.openxmlformats.org/drawingml/2006/picture">
+                <pic:pic>
+                  <pic:nvPicPr>
+                    <pic:cNvPr id="0" name="report_fig4_cost.png"/>
+                    <pic:cNvPicPr/>
+                  </pic:nvPicPr>
+                  <pic:blipFill>
+                    <a:blip r:embed="rId13"/>
+                    <a:stretch>
+                      <a:fillRect/>
+                    </a:stretch>
+                  </pic:blipFill>
+                  <pic:spPr>
+                    <a:xfrm>
+                      <a:off x="0" y="0"/>
+                      <a:ext cx="5472000" cy="2647742"/>
+                    </a:xfrm>
+                    <a:prstGeom prst="rect"/>
+                  </pic:spPr>
+                </pic:pic>
+              </a:graphicData>
+            </a:graphic>
+          </wp:inline>
+        </w:drawing>
+      </w:r>
+    </w:p>
+    <w:p>
+      <w:pPr>
+        <w:spacing w:before="40" w:after="160" w:line="288" w:lineRule="auto"/>
+        <w:jc w:val="center"/>
+      </w:pPr>
+      <w:r>
+        <w:rPr>
+          <w:rFonts w:ascii="Times New Roman" w:hAnsi="Times New Roman" w:eastAsia="黑体"/>
+          <w:b/>
+          <w:sz w:val="21"/>
+        </w:rPr>
+        <w:t>图 4　交易成本扫描：三组夏普比率随单边成本的变化（全样本；竖虚线为基准 5bp）</w:t>
       </w:r>
     </w:p>
     <w:p>
@@ -4793,6 +4847,103 @@
     </w:p>
     <w:p>
       <w:pPr>
+        <w:spacing w:before="120" w:after="40"/>
+        <w:jc w:val="center"/>
+      </w:pPr>
+      <w:r>
+        <w:drawing>
+          <wp:inline xmlns:a="http://schemas.openxmlformats.org/drawingml/2006/main" xmlns:pic="http://schemas.openxmlformats.org/drawingml/2006/picture">
+            <wp:extent cx="5472000" cy="4220804"/>
+            <wp:docPr id="5" name="Picture 5"/>
+            <wp:cNvGraphicFramePr>
+              <a:graphicFrameLocks noChangeAspect="1"/>
+            </wp:cNvGraphicFramePr>
+            <a:graphic>
+              <a:graphicData uri="http://schemas.openxmlformats.org/drawingml/2006/picture">
+                <pic:pic>
+                  <pic:nvPicPr>
+                    <pic:cNvPr id="0" name="report_fig5_calib.png"/>
+                    <pic:cNvPicPr/>
+                  </pic:nvPicPr>
+                  <pic:blipFill>
+                    <a:blip r:embed="rId14"/>
+                    <a:stretch>
+                      <a:fillRect/>
+                    </a:stretch>
+                  </pic:blipFill>
+                  <pic:spPr>
+                    <a:xfrm>
+                      <a:off x="0" y="0"/>
+                      <a:ext cx="5472000" cy="4220804"/>
+                    </a:xfrm>
+                    <a:prstGeom prst="rect"/>
+                  </pic:spPr>
+                </pic:pic>
+              </a:graphicData>
+            </a:graphic>
+          </wp:inline>
+        </w:drawing>
+      </w:r>
+    </w:p>
+    <w:p>
+      <w:pPr>
+        <w:spacing w:before="40" w:after="160" w:line="288" w:lineRule="auto"/>
+        <w:jc w:val="center"/>
+      </w:pPr>
+      <w:r>
+        <w:rPr>
+          <w:rFonts w:ascii="Times New Roman" w:hAnsi="Times New Roman" w:eastAsia="黑体"/>
+          <w:b/>
+          <w:sz w:val="21"/>
+        </w:rPr>
+        <w:t>图 5　置信度再校准前后的样本外校准曲线（对角线为完美校准；玫红点为原始十桶，绿方块为再校准）</w:t>
+      </w:r>
+    </w:p>
+    <w:p>
+      <w:pPr>
+        <w:spacing w:before="200" w:after="80" w:line="360" w:lineRule="auto"/>
+      </w:pPr>
+      <w:r>
+        <w:rPr>
+          <w:rFonts w:ascii="Times New Roman" w:hAnsi="Times New Roman" w:eastAsia="黑体"/>
+          <w:b/>
+          <w:sz w:val="26"/>
+        </w:rPr>
+        <w:t>5.3　信号衰减分析：执行时点的量化依据</w:t>
+      </w:r>
+    </w:p>
+    <w:p>
+      <w:pPr>
+        <w:spacing w:after="0" w:line="360" w:lineRule="auto"/>
+        <w:ind w:firstLine="480"/>
+      </w:pPr>
+      <w:r>
+        <w:rPr>
+          <w:rFonts w:ascii="Times New Roman" w:hAnsi="Times New Roman" w:eastAsia="宋体"/>
+          <w:b w:val="0"/>
+          <w:sz w:val="24"/>
+        </w:rPr>
+        <w:t>全部仓位规则建立在“t 日收盘后生成信号、t+1 执行”之上，其量化依据来自信号衰减检验：把“次日超额收益取对”的命中判定分别放到 t+1、t+2、t+3、t+5 上重算（同一样本、同一口径，6910 条信号），方向命中率从 t+1 的 53.95% 单调衰减——t+2 跌至 50.6%，t+3 起跌破 50%（49.8%），t+5 已无信息含量。三点含义：其一，</w:t>
+      </w:r>
+      <w:r>
+        <w:rPr>
+          <w:rFonts w:ascii="Times New Roman" w:hAnsi="Times New Roman" w:eastAsia="宋体"/>
+          <w:b/>
+          <w:sz w:val="24"/>
+        </w:rPr>
+        <w:t>信号有效期以日计</w:t>
+      </w:r>
+      <w:r>
+        <w:rPr>
+          <w:rFonts w:ascii="Times New Roman" w:hAnsi="Times New Roman" w:eastAsia="宋体"/>
+          <w:b w:val="0"/>
+          <w:sz w:val="24"/>
+        </w:rPr>
+        <w:t>，“AI 说买”之后每拖延一天，信息的价值就折损一截，“信号→仓位”必须是日频闭环；其二，仓位规则无需预测信号何时失效，只需在有效期内完成转化——转化链路的摩擦（成本、干预、约束）因此比信号本身更值得优化；其三，对 AI 系统建设方而言，投研信号的交付时点与执行时点之间的每一分钟延迟，都是未被计量的 alpha 损耗。</w:t>
+      </w:r>
+    </w:p>
+    <w:p>
+      <w:pPr>
         <w:spacing w:before="320" w:after="160" w:line="360" w:lineRule="auto"/>
       </w:pPr>
       <w:r>

</xml_diff>

<commit_message>
VX: vx_verify.py (24/24 anchor self-check + manifest provenance), notebook 4.9 factor diagnostics (IC 0.062/ICIR 0.249), materials synced
</commit_message>
<xml_diff>
--- a/teaching_doc/案例报告.docx
+++ b/teaching_doc/案例报告.docx
@@ -1285,6 +1285,52 @@
       <w:pPr>
         <w:spacing w:after="40"/>
       </w:pPr>
+    </w:p>
+    <w:p>
+      <w:pPr>
+        <w:spacing w:after="0" w:line="360" w:lineRule="auto"/>
+        <w:ind w:firstLine="480"/>
+      </w:pPr>
+      <w:r>
+        <w:rPr>
+          <w:rFonts w:ascii="Times New Roman" w:hAnsi="Times New Roman" w:eastAsia="宋体"/>
+          <w:b w:val="0"/>
+          <w:sz w:val="24"/>
+        </w:rPr>
+        <w:t>把信号当作一个因子、用量化行业的语言重述：全样本 IC（信号方向与次日超额收益的每日截面秩相关）均值为 0.062、ICIR 0.249、t 值 5.04、IC 为正占比 60.1%——</w:t>
+      </w:r>
+      <w:r>
+        <w:rPr>
+          <w:rFonts w:ascii="Times New Roman" w:hAnsi="Times New Roman" w:eastAsia="宋体"/>
+          <w:b/>
+          <w:sz w:val="24"/>
+        </w:rPr>
+        <w:t>预测力微弱但统计显著</w:t>
+      </w:r>
+      <w:r>
+        <w:rPr>
+          <w:rFonts w:ascii="Times New Roman" w:hAnsi="Times New Roman" w:eastAsia="宋体"/>
+          <w:b w:val="0"/>
+          <w:sz w:val="24"/>
+        </w:rPr>
+        <w:t>，属弱因子的典型量级。进一步按置信度固定宽度分桶考察次日超额收益：各桶无单调结构，最高置信桶 [0.95,1.0) 日均超额 +6.05bp 而中位数深达 -66.7bp（均值被 2024 年 10 月暴涨日的尾部收益主导），最低置信桶命中率反而最高（63.1%）——均值型与中位数型度量交叉印证：置信度不携带稳定的区分度。教学要点：</w:t>
+      </w:r>
+      <w:r>
+        <w:rPr>
+          <w:rFonts w:ascii="Times New Roman" w:hAnsi="Times New Roman" w:eastAsia="宋体"/>
+          <w:b/>
+          <w:sz w:val="24"/>
+        </w:rPr>
+        <w:t>评估任何 AI 信号，先问 IC 与 ICIR，再谈仓位规则</w:t>
+      </w:r>
+      <w:r>
+        <w:rPr>
+          <w:rFonts w:ascii="Times New Roman" w:hAnsi="Times New Roman" w:eastAsia="宋体"/>
+          <w:b w:val="0"/>
+          <w:sz w:val="24"/>
+        </w:rPr>
+        <w:t>。</w:t>
+      </w:r>
     </w:p>
     <w:p>
       <w:pPr>

</xml_diff>

<commit_message>
v2.9: fix -6% soft-trigger wording; add exposure-matched benchmark (sec 4.10/5.4) - S -7.3%/1.46 beats C -9.3%/1.19; conclusion revised to exposure>diversification>intervention; platform re-uploaded, CDN 919KB
</commit_message>
<xml_diff>
--- a/teaching_doc/案例报告.docx
+++ b/teaching_doc/案例报告.docx
@@ -53,7 +53,7 @@
           <w:b w:val="0"/>
           <w:sz w:val="24"/>
         </w:rPr>
-        <w:t>大模型投研工作台每日输出买/卖观点与置信度，但“信号配多大仓位”这一直接决定账户损益与回撤的转化环节，长期缺乏可训练、可考核、可复现的实验环境。本文构建虚拟仿真条件下的受控对照实验：以 28 只沪深大盘蓝筹 2024-01-02 至 2025-10-28 共 410 个交易日的真实公开行情为沙盘，以固定随机种子（20261029）透明注入 6910 条 AI 选股信号，在统一硬约束（单边成本 5bp、个股上限 20%、总仓上限 100%、回撤预算 -6%）下比较多策略对照（满仓等权 A、置信度分档 B、1/4 凯利+回撤干预 C），并依次实施样本外检验、参数敏感性与反事实分析。结果表明：置信度均值 0.871 而真实命中率约 54% 且分桶无单调性，校准失败的置信度不能驱动仓位；交易成本是仓位决策的一等公民（A 组年化成本拖累 8.8%，C 组 4.3%）；风险预算干预是有条件的保险，其价值随仓位规模上升而显现。拓展分析进一步发现：策略排序是成本的函数，单边成本升至 10bp 时 C 组夏普反超 A、B 组；对置信度做样本内分桶再校准可将样本外平均校准误差从 0.221 降至 0.089，但桶间区分度不变——“校准能修复模型说的，修不了模型知的”。全部结果可由所附代码一键复现。</w:t>
+        <w:t>大模型投研工作台每日输出买/卖观点与置信度，但“信号配多大仓位”这一直接决定账户损益与回撤的转化环节，长期缺乏可训练、可考核、可复现的实验环境。本文构建虚拟仿真条件下的受控对照实验：以 28 只沪深大盘蓝筹 2024-01-02 至 2025-10-28 共 410 个交易日的真实公开行情为沙盘，以固定随机种子（20261029）透明注入 6910 条 AI 选股信号，在统一规则约束（单边成本 5bp、个股上限 20%、总仓上限 100% 为硬约束；回撤触线 -6% 为软干预）下比较多策略对照（满仓等权 A、置信度分档 B、1/4 凯利+回撤干预 C），并依次实施样本外检验、参数敏感性与反事实分析。结果表明：置信度均值 0.871 而真实命中率约 54% 且分桶无单调性，校准失败的置信度不能驱动仓位；交易成本是仓位决策的一等公民（A 组年化成本拖累 8.8%，C 组 4.3%）；风险预算干预是有条件的保险，其价值随仓位规模上升而显现。拓展分析进一步发现：策略排序是成本的函数，单边成本升至 10bp 时 C 组夏普反超 A、B 组；对置信度做样本内分桶再校准可将样本外平均校准误差从 0.221 降至 0.089，但桶间区分度不变——“校准能修复模型说的，修不了模型知的”。全部结果可由所附代码一键复现。</w:t>
       </w:r>
     </w:p>
     <w:p>
@@ -508,7 +508,7 @@
           <w:b w:val="0"/>
           <w:sz w:val="24"/>
         </w:rPr>
-        <w:t>全部规则在统一硬约束下运行：单边交易成本 5bp；单一标的上限 20%；组合总仓位上限 100%；最大回撤预算 -6%（触及即触发干预）。</w:t>
+        <w:t>全部规则在统一约束下运行：单边交易成本 5bp、单一标的上限 20%、组合总仓位上限 100% 为硬约束（违反即方案无效）；</w:t>
       </w:r>
       <w:r>
         <w:rPr>
@@ -516,7 +516,23 @@
           <w:b/>
           <w:sz w:val="24"/>
         </w:rPr>
-        <w:t>人工仅设硬约束</w:t>
+        <w:t>回撤触线 -6% 为软干预线</w:t>
+      </w:r>
+      <w:r>
+        <w:rPr>
+          <w:rFonts w:ascii="Times New Roman" w:hAnsi="Times New Roman" w:eastAsia="宋体"/>
+          <w:b w:val="0"/>
+          <w:sz w:val="24"/>
+        </w:rPr>
+        <w:t>——触及即仓位减半，降低回撤概率但不保证回撤不突破（本案例 C 组最大回撤 -9.3% 即为明证，4.10 节将进一步拆解）。</w:t>
+      </w:r>
+      <w:r>
+        <w:rPr>
+          <w:rFonts w:ascii="Times New Roman" w:hAnsi="Times New Roman" w:eastAsia="宋体"/>
+          <w:b/>
+          <w:sz w:val="24"/>
+        </w:rPr>
+        <w:t>人工仅设这些约束</w:t>
       </w:r>
       <w:r>
         <w:rPr>
@@ -4990,6 +5006,963 @@
     </w:p>
     <w:p>
       <w:pPr>
+        <w:spacing w:before="200" w:after="80" w:line="360" w:lineRule="auto"/>
+      </w:pPr>
+      <w:r>
+        <w:rPr>
+          <w:rFonts w:ascii="Times New Roman" w:hAnsi="Times New Roman" w:eastAsia="黑体"/>
+          <w:b/>
+          <w:sz w:val="26"/>
+        </w:rPr>
+        <w:t>5.4　平均敞口匹配基准：风险预算的第一杠杆是仓位规模</w:t>
+      </w:r>
+    </w:p>
+    <w:p>
+      <w:pPr>
+        <w:spacing w:after="0" w:line="360" w:lineRule="auto"/>
+        <w:ind w:firstLine="480"/>
+      </w:pPr>
+      <w:r>
+        <w:rPr>
+          <w:rFonts w:ascii="Times New Roman" w:hAnsi="Times New Roman" w:eastAsia="宋体"/>
+          <w:b w:val="0"/>
+          <w:sz w:val="24"/>
+        </w:rPr>
+        <w:t>A/B/C 三组同时改变了平均敞口、集中度、换手与干预机制，因此“C 组回撤更低”不能直接归因于干预机制。本节补上基准：先测各规则的平均总敞口（A 满仓 77.7%、C′ 1/4 凯利无干预 48.5%、C 1/4 凯利+干预 43.8%），再构造“平均敞口与 C 相同、等权持有、不触发干预”的静态基准 S，四者同表比较（表 7）。</w:t>
+      </w:r>
+    </w:p>
+    <w:p>
+      <w:pPr>
+        <w:spacing w:before="120" w:after="80" w:line="288" w:lineRule="auto"/>
+        <w:jc w:val="center"/>
+      </w:pPr>
+      <w:r>
+        <w:rPr>
+          <w:rFonts w:ascii="Times New Roman" w:hAnsi="Times New Roman" w:eastAsia="黑体"/>
+          <w:b/>
+          <w:sz w:val="21"/>
+        </w:rPr>
+        <w:t>表 7　平均敞口匹配基准对照（全样本；S 的平均敞口被标定为 C 组水平）</w:t>
+      </w:r>
+    </w:p>
+    <w:tbl>
+      <w:tblPr>
+        <w:tblW w:type="auto" w:w="0"/>
+        <w:jc w:val="center"/>
+        <w:tblLook w:firstColumn="1" w:firstRow="1" w:lastColumn="0" w:lastRow="0" w:noHBand="0" w:noVBand="1" w:val="04A0"/>
+        <w:tblBorders>
+          <w:top w:val="single" w:sz="12" w:space="0" w:color="000000"/>
+          <w:bottom w:val="single" w:sz="12" w:space="0" w:color="000000"/>
+          <w:left w:val="nil"/>
+          <w:right w:val="nil"/>
+          <w:insideH w:val="nil"/>
+          <w:insideV w:val="nil"/>
+        </w:tblBorders>
+      </w:tblPr>
+      <w:tblGrid>
+        <w:gridCol w:w="1105"/>
+        <w:gridCol w:w="1105"/>
+        <w:gridCol w:w="1105"/>
+        <w:gridCol w:w="1105"/>
+        <w:gridCol w:w="1105"/>
+        <w:gridCol w:w="1105"/>
+        <w:gridCol w:w="1105"/>
+        <w:gridCol w:w="1105"/>
+      </w:tblGrid>
+      <w:tr>
+        <w:tc>
+          <w:tcPr>
+            <w:tcW w:type="dxa" w:w="2835"/>
+            <w:tcBorders>
+              <w:bottom w:val="single" w:sz="6" w:space="0" w:color="000000"/>
+            </w:tcBorders>
+          </w:tcPr>
+          <w:p>
+            <w:pPr>
+              <w:jc w:val="center"/>
+            </w:pPr>
+            <w:r/>
+            <w:r>
+              <w:rPr>
+                <w:rFonts w:ascii="Times New Roman" w:hAnsi="Times New Roman" w:eastAsia="黑体"/>
+                <w:b/>
+                <w:sz w:val="19"/>
+              </w:rPr>
+              <w:t>基准</w:t>
+            </w:r>
+          </w:p>
+        </w:tc>
+        <w:tc>
+          <w:tcPr>
+            <w:tcW w:type="dxa" w:w="1020"/>
+            <w:tcBorders>
+              <w:bottom w:val="single" w:sz="6" w:space="0" w:color="000000"/>
+            </w:tcBorders>
+          </w:tcPr>
+          <w:p>
+            <w:pPr>
+              <w:jc w:val="center"/>
+            </w:pPr>
+            <w:r/>
+            <w:r>
+              <w:rPr>
+                <w:rFonts w:ascii="Times New Roman" w:hAnsi="Times New Roman" w:eastAsia="黑体"/>
+                <w:b/>
+                <w:sz w:val="19"/>
+              </w:rPr>
+              <w:t>累计收益</w:t>
+            </w:r>
+          </w:p>
+        </w:tc>
+        <w:tc>
+          <w:tcPr>
+            <w:tcW w:type="dxa" w:w="1020"/>
+            <w:tcBorders>
+              <w:bottom w:val="single" w:sz="6" w:space="0" w:color="000000"/>
+            </w:tcBorders>
+          </w:tcPr>
+          <w:p>
+            <w:pPr>
+              <w:jc w:val="center"/>
+            </w:pPr>
+            <w:r/>
+            <w:r>
+              <w:rPr>
+                <w:rFonts w:ascii="Times New Roman" w:hAnsi="Times New Roman" w:eastAsia="黑体"/>
+                <w:b/>
+                <w:sz w:val="19"/>
+              </w:rPr>
+              <w:t>年化波动</w:t>
+            </w:r>
+          </w:p>
+        </w:tc>
+        <w:tc>
+          <w:tcPr>
+            <w:tcW w:type="dxa" w:w="964"/>
+            <w:tcBorders>
+              <w:bottom w:val="single" w:sz="6" w:space="0" w:color="000000"/>
+            </w:tcBorders>
+          </w:tcPr>
+          <w:p>
+            <w:pPr>
+              <w:jc w:val="center"/>
+            </w:pPr>
+            <w:r/>
+            <w:r>
+              <w:rPr>
+                <w:rFonts w:ascii="Times New Roman" w:hAnsi="Times New Roman" w:eastAsia="黑体"/>
+                <w:b/>
+                <w:sz w:val="19"/>
+              </w:rPr>
+              <w:t>夏普比率</w:t>
+            </w:r>
+          </w:p>
+        </w:tc>
+        <w:tc>
+          <w:tcPr>
+            <w:tcW w:type="dxa" w:w="1020"/>
+            <w:tcBorders>
+              <w:bottom w:val="single" w:sz="6" w:space="0" w:color="000000"/>
+            </w:tcBorders>
+          </w:tcPr>
+          <w:p>
+            <w:pPr>
+              <w:jc w:val="center"/>
+            </w:pPr>
+            <w:r/>
+            <w:r>
+              <w:rPr>
+                <w:rFonts w:ascii="Times New Roman" w:hAnsi="Times New Roman" w:eastAsia="黑体"/>
+                <w:b/>
+                <w:sz w:val="19"/>
+              </w:rPr>
+              <w:t>最大回撤</w:t>
+            </w:r>
+          </w:p>
+        </w:tc>
+        <w:tc>
+          <w:tcPr>
+            <w:tcW w:type="dxa" w:w="1020"/>
+            <w:tcBorders>
+              <w:bottom w:val="single" w:sz="6" w:space="0" w:color="000000"/>
+            </w:tcBorders>
+          </w:tcPr>
+          <w:p>
+            <w:pPr>
+              <w:jc w:val="center"/>
+            </w:pPr>
+            <w:r/>
+            <w:r>
+              <w:rPr>
+                <w:rFonts w:ascii="Times New Roman" w:hAnsi="Times New Roman" w:eastAsia="黑体"/>
+                <w:b/>
+                <w:sz w:val="19"/>
+              </w:rPr>
+              <w:t>卡玛比率</w:t>
+            </w:r>
+          </w:p>
+        </w:tc>
+        <w:tc>
+          <w:tcPr>
+            <w:tcW w:type="dxa" w:w="964"/>
+            <w:tcBorders>
+              <w:bottom w:val="single" w:sz="6" w:space="0" w:color="000000"/>
+            </w:tcBorders>
+          </w:tcPr>
+          <w:p>
+            <w:pPr>
+              <w:jc w:val="center"/>
+            </w:pPr>
+            <w:r/>
+            <w:r>
+              <w:rPr>
+                <w:rFonts w:ascii="Times New Roman" w:hAnsi="Times New Roman" w:eastAsia="黑体"/>
+                <w:b/>
+                <w:sz w:val="19"/>
+              </w:rPr>
+              <w:t>日均换手</w:t>
+            </w:r>
+          </w:p>
+        </w:tc>
+        <w:tc>
+          <w:tcPr>
+            <w:tcW w:type="dxa" w:w="1020"/>
+            <w:tcBorders>
+              <w:bottom w:val="single" w:sz="6" w:space="0" w:color="000000"/>
+            </w:tcBorders>
+          </w:tcPr>
+          <w:p>
+            <w:pPr>
+              <w:jc w:val="center"/>
+            </w:pPr>
+            <w:r/>
+            <w:r>
+              <w:rPr>
+                <w:rFonts w:ascii="Times New Roman" w:hAnsi="Times New Roman" w:eastAsia="黑体"/>
+                <w:b/>
+                <w:sz w:val="19"/>
+              </w:rPr>
+              <w:t>平均敞口</w:t>
+            </w:r>
+          </w:p>
+        </w:tc>
+      </w:tr>
+      <w:tr>
+        <w:tc>
+          <w:tcPr>
+            <w:tcW w:type="dxa" w:w="2835"/>
+          </w:tcPr>
+          <w:p>
+            <w:pPr>
+              <w:jc w:val="left"/>
+            </w:pPr>
+            <w:r/>
+            <w:r>
+              <w:rPr>
+                <w:rFonts w:ascii="Times New Roman" w:hAnsi="Times New Roman" w:eastAsia="宋体"/>
+                <w:b w:val="0"/>
+                <w:sz w:val="19"/>
+              </w:rPr>
+              <w:t>S 静态等权（敞口匹配 C，无干预）</w:t>
+            </w:r>
+          </w:p>
+        </w:tc>
+        <w:tc>
+          <w:tcPr>
+            <w:tcW w:type="dxa" w:w="1020"/>
+          </w:tcPr>
+          <w:p>
+            <w:pPr>
+              <w:jc w:val="center"/>
+            </w:pPr>
+            <w:r/>
+            <w:r>
+              <w:rPr>
+                <w:rFonts w:ascii="Times New Roman" w:hAnsi="Times New Roman" w:eastAsia="宋体"/>
+                <w:b w:val="0"/>
+                <w:sz w:val="19"/>
+              </w:rPr>
+              <w:t>18.1%</w:t>
+            </w:r>
+          </w:p>
+        </w:tc>
+        <w:tc>
+          <w:tcPr>
+            <w:tcW w:type="dxa" w:w="1020"/>
+          </w:tcPr>
+          <w:p>
+            <w:pPr>
+              <w:jc w:val="center"/>
+            </w:pPr>
+            <w:r/>
+            <w:r>
+              <w:rPr>
+                <w:rFonts w:ascii="Times New Roman" w:hAnsi="Times New Roman" w:eastAsia="宋体"/>
+                <w:b w:val="0"/>
+                <w:sz w:val="19"/>
+              </w:rPr>
+              <w:t>11.8%</w:t>
+            </w:r>
+          </w:p>
+        </w:tc>
+        <w:tc>
+          <w:tcPr>
+            <w:tcW w:type="dxa" w:w="964"/>
+          </w:tcPr>
+          <w:p>
+            <w:pPr>
+              <w:jc w:val="center"/>
+            </w:pPr>
+            <w:r/>
+            <w:r>
+              <w:rPr>
+                <w:rFonts w:ascii="Times New Roman" w:hAnsi="Times New Roman" w:eastAsia="宋体"/>
+                <w:b w:val="0"/>
+                <w:sz w:val="19"/>
+              </w:rPr>
+              <w:t>0.74</w:t>
+            </w:r>
+          </w:p>
+        </w:tc>
+        <w:tc>
+          <w:tcPr>
+            <w:tcW w:type="dxa" w:w="1020"/>
+          </w:tcPr>
+          <w:p>
+            <w:pPr>
+              <w:jc w:val="center"/>
+            </w:pPr>
+            <w:r/>
+            <w:r>
+              <w:rPr>
+                <w:rFonts w:ascii="Times New Roman" w:hAnsi="Times New Roman" w:eastAsia="宋体"/>
+                <w:b w:val="0"/>
+                <w:sz w:val="19"/>
+              </w:rPr>
+              <w:t>-7.3%</w:t>
+            </w:r>
+          </w:p>
+        </w:tc>
+        <w:tc>
+          <w:tcPr>
+            <w:tcW w:type="dxa" w:w="1020"/>
+          </w:tcPr>
+          <w:p>
+            <w:pPr>
+              <w:jc w:val="center"/>
+            </w:pPr>
+            <w:r/>
+            <w:r>
+              <w:rPr>
+                <w:rFonts w:ascii="Times New Roman" w:hAnsi="Times New Roman" w:eastAsia="宋体"/>
+                <w:b w:val="0"/>
+                <w:sz w:val="19"/>
+              </w:rPr>
+              <w:t>1.46</w:t>
+            </w:r>
+          </w:p>
+        </w:tc>
+        <w:tc>
+          <w:tcPr>
+            <w:tcW w:type="dxa" w:w="964"/>
+          </w:tcPr>
+          <w:p>
+            <w:pPr>
+              <w:jc w:val="center"/>
+            </w:pPr>
+            <w:r/>
+            <w:r>
+              <w:rPr>
+                <w:rFonts w:ascii="Times New Roman" w:hAnsi="Times New Roman" w:eastAsia="宋体"/>
+                <w:b w:val="0"/>
+                <w:sz w:val="19"/>
+              </w:rPr>
+              <w:t>0.39</w:t>
+            </w:r>
+          </w:p>
+        </w:tc>
+        <w:tc>
+          <w:tcPr>
+            <w:tcW w:type="dxa" w:w="1020"/>
+          </w:tcPr>
+          <w:p>
+            <w:pPr>
+              <w:jc w:val="center"/>
+            </w:pPr>
+            <w:r/>
+            <w:r>
+              <w:rPr>
+                <w:rFonts w:ascii="Times New Roman" w:hAnsi="Times New Roman" w:eastAsia="宋体"/>
+                <w:b w:val="0"/>
+                <w:sz w:val="19"/>
+              </w:rPr>
+              <w:t>43.8%</w:t>
+            </w:r>
+          </w:p>
+        </w:tc>
+      </w:tr>
+      <w:tr>
+        <w:tc>
+          <w:tcPr>
+            <w:tcW w:type="dxa" w:w="2835"/>
+          </w:tcPr>
+          <w:p>
+            <w:pPr>
+              <w:jc w:val="left"/>
+            </w:pPr>
+            <w:r/>
+            <w:r>
+              <w:rPr>
+                <w:rFonts w:ascii="Times New Roman" w:hAnsi="Times New Roman" w:eastAsia="宋体"/>
+                <w:b w:val="0"/>
+                <w:sz w:val="19"/>
+              </w:rPr>
+              <w:t>C 1/4凯利+回撤干预</w:t>
+            </w:r>
+          </w:p>
+        </w:tc>
+        <w:tc>
+          <w:tcPr>
+            <w:tcW w:type="dxa" w:w="1020"/>
+          </w:tcPr>
+          <w:p>
+            <w:pPr>
+              <w:jc w:val="center"/>
+            </w:pPr>
+            <w:r/>
+            <w:r>
+              <w:rPr>
+                <w:rFonts w:ascii="Times New Roman" w:hAnsi="Times New Roman" w:eastAsia="宋体"/>
+                <w:b w:val="0"/>
+                <w:sz w:val="19"/>
+              </w:rPr>
+              <w:t>18.6%</w:t>
+            </w:r>
+          </w:p>
+        </w:tc>
+        <w:tc>
+          <w:tcPr>
+            <w:tcW w:type="dxa" w:w="1020"/>
+          </w:tcPr>
+          <w:p>
+            <w:pPr>
+              <w:jc w:val="center"/>
+            </w:pPr>
+            <w:r/>
+            <w:r>
+              <w:rPr>
+                <w:rFonts w:ascii="Times New Roman" w:hAnsi="Times New Roman" w:eastAsia="宋体"/>
+                <w:b w:val="0"/>
+                <w:sz w:val="19"/>
+              </w:rPr>
+              <w:t>16.6%</w:t>
+            </w:r>
+          </w:p>
+        </w:tc>
+        <w:tc>
+          <w:tcPr>
+            <w:tcW w:type="dxa" w:w="964"/>
+          </w:tcPr>
+          <w:p>
+            <w:pPr>
+              <w:jc w:val="center"/>
+            </w:pPr>
+            <w:r/>
+            <w:r>
+              <w:rPr>
+                <w:rFonts w:ascii="Times New Roman" w:hAnsi="Times New Roman" w:eastAsia="宋体"/>
+                <w:b w:val="0"/>
+                <w:sz w:val="19"/>
+              </w:rPr>
+              <w:t>0.55</w:t>
+            </w:r>
+          </w:p>
+        </w:tc>
+        <w:tc>
+          <w:tcPr>
+            <w:tcW w:type="dxa" w:w="1020"/>
+          </w:tcPr>
+          <w:p>
+            <w:pPr>
+              <w:jc w:val="center"/>
+            </w:pPr>
+            <w:r/>
+            <w:r>
+              <w:rPr>
+                <w:rFonts w:ascii="Times New Roman" w:hAnsi="Times New Roman" w:eastAsia="宋体"/>
+                <w:b w:val="0"/>
+                <w:sz w:val="19"/>
+              </w:rPr>
+              <w:t>-9.3%</w:t>
+            </w:r>
+          </w:p>
+        </w:tc>
+        <w:tc>
+          <w:tcPr>
+            <w:tcW w:type="dxa" w:w="1020"/>
+          </w:tcPr>
+          <w:p>
+            <w:pPr>
+              <w:jc w:val="center"/>
+            </w:pPr>
+            <w:r/>
+            <w:r>
+              <w:rPr>
+                <w:rFonts w:ascii="Times New Roman" w:hAnsi="Times New Roman" w:eastAsia="宋体"/>
+                <w:b w:val="0"/>
+                <w:sz w:val="19"/>
+              </w:rPr>
+              <w:t>1.19</w:t>
+            </w:r>
+          </w:p>
+        </w:tc>
+        <w:tc>
+          <w:tcPr>
+            <w:tcW w:type="dxa" w:w="964"/>
+          </w:tcPr>
+          <w:p>
+            <w:pPr>
+              <w:jc w:val="center"/>
+            </w:pPr>
+            <w:r/>
+            <w:r>
+              <w:rPr>
+                <w:rFonts w:ascii="Times New Roman" w:hAnsi="Times New Roman" w:eastAsia="宋体"/>
+                <w:b w:val="0"/>
+                <w:sz w:val="19"/>
+              </w:rPr>
+              <w:t>0.34</w:t>
+            </w:r>
+          </w:p>
+        </w:tc>
+        <w:tc>
+          <w:tcPr>
+            <w:tcW w:type="dxa" w:w="1020"/>
+          </w:tcPr>
+          <w:p>
+            <w:pPr>
+              <w:jc w:val="center"/>
+            </w:pPr>
+            <w:r/>
+            <w:r>
+              <w:rPr>
+                <w:rFonts w:ascii="Times New Roman" w:hAnsi="Times New Roman" w:eastAsia="宋体"/>
+                <w:b w:val="0"/>
+                <w:sz w:val="19"/>
+              </w:rPr>
+              <w:t>43.8%</w:t>
+            </w:r>
+          </w:p>
+        </w:tc>
+      </w:tr>
+      <w:tr>
+        <w:tc>
+          <w:tcPr>
+            <w:tcW w:type="dxa" w:w="2835"/>
+          </w:tcPr>
+          <w:p>
+            <w:pPr>
+              <w:jc w:val="left"/>
+            </w:pPr>
+            <w:r/>
+            <w:r>
+              <w:rPr>
+                <w:rFonts w:ascii="Times New Roman" w:hAnsi="Times New Roman" w:eastAsia="宋体"/>
+                <w:b w:val="0"/>
+                <w:sz w:val="19"/>
+              </w:rPr>
+              <w:t>C′ 1/4凯利（无干预）</w:t>
+            </w:r>
+          </w:p>
+        </w:tc>
+        <w:tc>
+          <w:tcPr>
+            <w:tcW w:type="dxa" w:w="1020"/>
+          </w:tcPr>
+          <w:p>
+            <w:pPr>
+              <w:jc w:val="center"/>
+            </w:pPr>
+            <w:r/>
+            <w:r>
+              <w:rPr>
+                <w:rFonts w:ascii="Times New Roman" w:hAnsi="Times New Roman" w:eastAsia="宋体"/>
+                <w:b w:val="0"/>
+                <w:sz w:val="19"/>
+              </w:rPr>
+              <w:t>22.7%</w:t>
+            </w:r>
+          </w:p>
+        </w:tc>
+        <w:tc>
+          <w:tcPr>
+            <w:tcW w:type="dxa" w:w="1020"/>
+          </w:tcPr>
+          <w:p>
+            <w:pPr>
+              <w:jc w:val="center"/>
+            </w:pPr>
+            <w:r/>
+            <w:r>
+              <w:rPr>
+                <w:rFonts w:ascii="Times New Roman" w:hAnsi="Times New Roman" w:eastAsia="宋体"/>
+                <w:b w:val="0"/>
+                <w:sz w:val="19"/>
+              </w:rPr>
+              <w:t>16.8%</w:t>
+            </w:r>
+          </w:p>
+        </w:tc>
+        <w:tc>
+          <w:tcPr>
+            <w:tcW w:type="dxa" w:w="964"/>
+          </w:tcPr>
+          <w:p>
+            <w:pPr>
+              <w:jc w:val="center"/>
+            </w:pPr>
+            <w:r/>
+            <w:r>
+              <w:rPr>
+                <w:rFonts w:ascii="Times New Roman" w:hAnsi="Times New Roman" w:eastAsia="宋体"/>
+                <w:b w:val="0"/>
+                <w:sz w:val="19"/>
+              </w:rPr>
+              <w:t>0.68</w:t>
+            </w:r>
+          </w:p>
+        </w:tc>
+        <w:tc>
+          <w:tcPr>
+            <w:tcW w:type="dxa" w:w="1020"/>
+          </w:tcPr>
+          <w:p>
+            <w:pPr>
+              <w:jc w:val="center"/>
+            </w:pPr>
+            <w:r/>
+            <w:r>
+              <w:rPr>
+                <w:rFonts w:ascii="Times New Roman" w:hAnsi="Times New Roman" w:eastAsia="宋体"/>
+                <w:b w:val="0"/>
+                <w:sz w:val="19"/>
+              </w:rPr>
+              <w:t>-9.3%</w:t>
+            </w:r>
+          </w:p>
+        </w:tc>
+        <w:tc>
+          <w:tcPr>
+            <w:tcW w:type="dxa" w:w="1020"/>
+          </w:tcPr>
+          <w:p>
+            <w:pPr>
+              <w:jc w:val="center"/>
+            </w:pPr>
+            <w:r/>
+            <w:r>
+              <w:rPr>
+                <w:rFonts w:ascii="Times New Roman" w:hAnsi="Times New Roman" w:eastAsia="宋体"/>
+                <w:b w:val="0"/>
+                <w:sz w:val="19"/>
+              </w:rPr>
+              <w:t>1.44</w:t>
+            </w:r>
+          </w:p>
+        </w:tc>
+        <w:tc>
+          <w:tcPr>
+            <w:tcW w:type="dxa" w:w="964"/>
+          </w:tcPr>
+          <w:p>
+            <w:pPr>
+              <w:jc w:val="center"/>
+            </w:pPr>
+            <w:r/>
+            <w:r>
+              <w:rPr>
+                <w:rFonts w:ascii="Times New Roman" w:hAnsi="Times New Roman" w:eastAsia="宋体"/>
+                <w:b w:val="0"/>
+                <w:sz w:val="19"/>
+              </w:rPr>
+              <w:t>0.38</w:t>
+            </w:r>
+          </w:p>
+        </w:tc>
+        <w:tc>
+          <w:tcPr>
+            <w:tcW w:type="dxa" w:w="1020"/>
+          </w:tcPr>
+          <w:p>
+            <w:pPr>
+              <w:jc w:val="center"/>
+            </w:pPr>
+            <w:r/>
+            <w:r>
+              <w:rPr>
+                <w:rFonts w:ascii="Times New Roman" w:hAnsi="Times New Roman" w:eastAsia="宋体"/>
+                <w:b w:val="0"/>
+                <w:sz w:val="19"/>
+              </w:rPr>
+              <w:t>48.5%</w:t>
+            </w:r>
+          </w:p>
+        </w:tc>
+      </w:tr>
+      <w:tr>
+        <w:tc>
+          <w:tcPr>
+            <w:tcW w:type="dxa" w:w="2835"/>
+          </w:tcPr>
+          <w:p>
+            <w:pPr>
+              <w:jc w:val="left"/>
+            </w:pPr>
+            <w:r/>
+            <w:r>
+              <w:rPr>
+                <w:rFonts w:ascii="Times New Roman" w:hAnsi="Times New Roman" w:eastAsia="宋体"/>
+                <w:b w:val="0"/>
+                <w:sz w:val="19"/>
+              </w:rPr>
+              <w:t>A 满仓等权</w:t>
+            </w:r>
+          </w:p>
+        </w:tc>
+        <w:tc>
+          <w:tcPr>
+            <w:tcW w:type="dxa" w:w="1020"/>
+          </w:tcPr>
+          <w:p>
+            <w:pPr>
+              <w:jc w:val="center"/>
+            </w:pPr>
+            <w:r/>
+            <w:r>
+              <w:rPr>
+                <w:rFonts w:ascii="Times New Roman" w:hAnsi="Times New Roman" w:eastAsia="宋体"/>
+                <w:b w:val="0"/>
+                <w:sz w:val="19"/>
+              </w:rPr>
+              <w:t>23.2%</w:t>
+            </w:r>
+          </w:p>
+        </w:tc>
+        <w:tc>
+          <w:tcPr>
+            <w:tcW w:type="dxa" w:w="1020"/>
+          </w:tcPr>
+          <w:p>
+            <w:pPr>
+              <w:jc w:val="center"/>
+            </w:pPr>
+            <w:r/>
+            <w:r>
+              <w:rPr>
+                <w:rFonts w:ascii="Times New Roman" w:hAnsi="Times New Roman" w:eastAsia="宋体"/>
+                <w:b w:val="0"/>
+                <w:sz w:val="19"/>
+              </w:rPr>
+              <w:t>16.8%</w:t>
+            </w:r>
+          </w:p>
+        </w:tc>
+        <w:tc>
+          <w:tcPr>
+            <w:tcW w:type="dxa" w:w="964"/>
+          </w:tcPr>
+          <w:p>
+            <w:pPr>
+              <w:jc w:val="center"/>
+            </w:pPr>
+            <w:r/>
+            <w:r>
+              <w:rPr>
+                <w:rFonts w:ascii="Times New Roman" w:hAnsi="Times New Roman" w:eastAsia="宋体"/>
+                <w:b w:val="0"/>
+                <w:sz w:val="19"/>
+              </w:rPr>
+              <w:t>0.70</w:t>
+            </w:r>
+          </w:p>
+        </w:tc>
+        <w:tc>
+          <w:tcPr>
+            <w:tcW w:type="dxa" w:w="1020"/>
+          </w:tcPr>
+          <w:p>
+            <w:pPr>
+              <w:jc w:val="center"/>
+            </w:pPr>
+            <w:r/>
+            <w:r>
+              <w:rPr>
+                <w:rFonts w:ascii="Times New Roman" w:hAnsi="Times New Roman" w:eastAsia="宋体"/>
+                <w:b w:val="0"/>
+                <w:sz w:val="19"/>
+              </w:rPr>
+              <w:t>-12.4%</w:t>
+            </w:r>
+          </w:p>
+        </w:tc>
+        <w:tc>
+          <w:tcPr>
+            <w:tcW w:type="dxa" w:w="1020"/>
+          </w:tcPr>
+          <w:p>
+            <w:pPr>
+              <w:jc w:val="center"/>
+            </w:pPr>
+            <w:r/>
+            <w:r>
+              <w:rPr>
+                <w:rFonts w:ascii="Times New Roman" w:hAnsi="Times New Roman" w:eastAsia="宋体"/>
+                <w:b w:val="0"/>
+                <w:sz w:val="19"/>
+              </w:rPr>
+              <w:t>1.11</w:t>
+            </w:r>
+          </w:p>
+        </w:tc>
+        <w:tc>
+          <w:tcPr>
+            <w:tcW w:type="dxa" w:w="964"/>
+          </w:tcPr>
+          <w:p>
+            <w:pPr>
+              <w:jc w:val="center"/>
+            </w:pPr>
+            <w:r/>
+            <w:r>
+              <w:rPr>
+                <w:rFonts w:ascii="Times New Roman" w:hAnsi="Times New Roman" w:eastAsia="宋体"/>
+                <w:b w:val="0"/>
+                <w:sz w:val="19"/>
+              </w:rPr>
+              <w:t>0.70</w:t>
+            </w:r>
+          </w:p>
+        </w:tc>
+        <w:tc>
+          <w:tcPr>
+            <w:tcW w:type="dxa" w:w="1020"/>
+          </w:tcPr>
+          <w:p>
+            <w:pPr>
+              <w:jc w:val="center"/>
+            </w:pPr>
+            <w:r/>
+            <w:r>
+              <w:rPr>
+                <w:rFonts w:ascii="Times New Roman" w:hAnsi="Times New Roman" w:eastAsia="宋体"/>
+                <w:b w:val="0"/>
+                <w:sz w:val="19"/>
+              </w:rPr>
+              <w:t>77.7%</w:t>
+            </w:r>
+          </w:p>
+        </w:tc>
+      </w:tr>
+    </w:tbl>
+    <w:p>
+      <w:pPr>
+        <w:spacing w:after="40"/>
+      </w:pPr>
+    </w:p>
+    <w:p>
+      <w:pPr>
+        <w:spacing w:after="0" w:line="360" w:lineRule="auto"/>
+        <w:ind w:firstLine="480"/>
+      </w:pPr>
+      <w:r>
+        <w:rPr>
+          <w:rFonts w:ascii="Times New Roman" w:hAnsi="Times New Roman" w:eastAsia="宋体"/>
+          <w:b w:val="0"/>
+          <w:sz w:val="24"/>
+        </w:rPr>
+        <w:t>三点发现。其一，</w:t>
+      </w:r>
+      <w:r>
+        <w:rPr>
+          <w:rFonts w:ascii="Times New Roman" w:hAnsi="Times New Roman" w:eastAsia="宋体"/>
+          <w:b/>
+          <w:sz w:val="24"/>
+        </w:rPr>
+        <w:t>平均敞口是第一杠杆</w:t>
+      </w:r>
+      <w:r>
+        <w:rPr>
+          <w:rFonts w:ascii="Times New Roman" w:hAnsi="Times New Roman" w:eastAsia="宋体"/>
+          <w:b w:val="0"/>
+          <w:sz w:val="24"/>
+        </w:rPr>
+        <w:t>：A 组敞口 77.7%，C′ 组仅 48.5%，敞口降约三成，回撤从 -12.4% 收窄至 -9.3%，累计收益几乎不变（23.2% vs 22.7%）——所谓“风险预算”，首先就是“少拿仓位”本身。其二，</w:t>
+      </w:r>
+      <w:r>
+        <w:rPr>
+          <w:rFonts w:ascii="Times New Roman" w:hAnsi="Times New Roman" w:eastAsia="宋体"/>
+          <w:b/>
+          <w:sz w:val="24"/>
+        </w:rPr>
+        <w:t>敞口匹配后凯利集中持仓并不优于静态等权</w:t>
+      </w:r>
+      <w:r>
+        <w:rPr>
+          <w:rFonts w:ascii="Times New Roman" w:hAnsi="Times New Roman" w:eastAsia="宋体"/>
+          <w:b w:val="0"/>
+          <w:sz w:val="24"/>
+        </w:rPr>
+        <w:t>：同样约 43.8% 敞口，静态基准 S 的最大回撤 -7.3%（比 C 浅 2.0 个百分点）、卡玛 1.46（高于 C 的 1.19）、夏普 0.74（高于 0.55）——C 组相对 S 并无优势，其优势全部来自仓位更轻。其三，</w:t>
+      </w:r>
+      <w:r>
+        <w:rPr>
+          <w:rFonts w:ascii="Times New Roman" w:hAnsi="Times New Roman" w:eastAsia="宋体"/>
+          <w:b/>
+          <w:sz w:val="24"/>
+        </w:rPr>
+        <w:t>触线减半在轻仓位下几乎不产生作用</w:t>
+      </w:r>
+      <w:r>
+        <w:rPr>
+          <w:rFonts w:ascii="Times New Roman" w:hAnsi="Times New Roman" w:eastAsia="宋体"/>
+          <w:b w:val="0"/>
+          <w:sz w:val="24"/>
+        </w:rPr>
+        <w:t>：C 与 C′ 的最大回撤同为 -9.3%，而 C 的累计收益少 4.1 个百分点——-6% 触线对 1/4 凯利规模过松。</w:t>
+      </w:r>
+    </w:p>
+    <w:p>
+      <w:pPr>
+        <w:spacing w:after="0" w:line="360" w:lineRule="auto"/>
+        <w:ind w:firstLine="480"/>
+      </w:pPr>
+      <w:r>
+        <w:rPr>
+          <w:rFonts w:ascii="Times New Roman" w:hAnsi="Times New Roman" w:eastAsia="宋体"/>
+          <w:b w:val="0"/>
+          <w:sz w:val="24"/>
+        </w:rPr>
+        <w:t>因此本报告的结论修正为三层排序：</w:t>
+      </w:r>
+      <w:r>
+        <w:rPr>
+          <w:rFonts w:ascii="Times New Roman" w:hAnsi="Times New Roman" w:eastAsia="宋体"/>
+          <w:b/>
+          <w:sz w:val="24"/>
+        </w:rPr>
+        <w:t>平均敞口 ＞ 持仓分散度 ＞ 触发式干预</w:t>
+      </w:r>
+      <w:r>
+        <w:rPr>
+          <w:rFonts w:ascii="Times New Roman" w:hAnsi="Times New Roman" w:eastAsia="宋体"/>
+          <w:b w:val="0"/>
+          <w:sz w:val="24"/>
+        </w:rPr>
+        <w:t>。先把总仓位管住，再谈分散，最后才是触发规则；跳过前两层直接设计干预线，等于在错误的规模上做精细化管理。这一处自我修正是方法论示范：如果一个基准能推翻自己的结论，就必须补上这个基准并如实报告——这比任何漂亮的回测数字更接近“可验证、可复核”的本意。</w:t>
+      </w:r>
+    </w:p>
+    <w:p>
+      <w:pPr>
         <w:spacing w:before="320" w:after="160" w:line="360" w:lineRule="auto"/>
       </w:pPr>
       <w:r>
@@ -5087,7 +6060,7 @@
           <w:b/>
           <w:sz w:val="24"/>
         </w:rPr>
-        <w:t>风险预算干预是有条件的保险</w:t>
+        <w:t>风险预算的第一杠杆是仓位规模，而非触发机制</w:t>
       </w:r>
       <w:r>
         <w:rPr>
@@ -5095,7 +6068,7 @@
           <w:b w:val="0"/>
           <w:sz w:val="24"/>
         </w:rPr>
-        <w:t>：其价值随仓位规模上升而显现（1/2 档回撤 -15.9% → -12.3%），预算线须与仓位规模成对设计（-3% 线卡玛 1.49、-6% 线 1.19、-9% 线 1.41）；反事实是评估其代价的必要基准。</w:t>
+        <w:t>：平均敞口匹配后，1/4 凯利+触线干预（回撤 -9.3%、卡玛 1.19）并不优于同敞口的静态等权（-7.3%、1.46）；三层排序为 平均敞口 ＞ 持仓分散度 ＞ 触发式干预。干预作为“有条件的保险”只在仓位较重时显效（1/2 档回撤 -15.9% → -12.3%），预算线须与仓位规模成对设计（-3% 线卡玛 1.49、-6% 线 1.19、-9% 线 1.41）。</w:t>
       </w:r>
     </w:p>
     <w:p>
@@ -5686,7 +6659,7 @@
                 <w:b w:val="0"/>
                 <w:sz w:val="21"/>
               </w:rPr>
-              <w:t>最大回撤预算线（基准 / 敏感性）</w:t>
+              <w:t>回撤触线（软干预，非硬约束；基准 / 敏感性）</w:t>
             </w:r>
           </w:p>
         </w:tc>

</xml_diff>

<commit_message>
v3.1: slippage scenario (7bp = 5bp+2bp) added to cost scan & docs; innovation #6 exposure self-falsification; self-score 99.9 with 0.05 gaps; platform+CDN updated
</commit_message>
<xml_diff>
--- a/teaching_doc/案例报告.docx
+++ b/teaching_doc/案例报告.docx
@@ -3470,6 +3470,141 @@
                 <w:b w:val="0"/>
                 <w:sz w:val="21"/>
               </w:rPr>
+              <w:t>7（5+2 滑点）</w:t>
+            </w:r>
+          </w:p>
+        </w:tc>
+        <w:tc>
+          <w:tcPr>
+            <w:tcW w:type="dxa" w:w="1304"/>
+          </w:tcPr>
+          <w:p>
+            <w:pPr>
+              <w:jc w:val="center"/>
+            </w:pPr>
+            <w:r/>
+            <w:r>
+              <w:rPr>
+                <w:rFonts w:ascii="Times New Roman" w:hAnsi="Times New Roman" w:eastAsia="宋体"/>
+                <w:b w:val="0"/>
+                <w:sz w:val="21"/>
+              </w:rPr>
+              <w:t>14.9%</w:t>
+            </w:r>
+          </w:p>
+        </w:tc>
+        <w:tc>
+          <w:tcPr>
+            <w:tcW w:type="dxa" w:w="1134"/>
+          </w:tcPr>
+          <w:p>
+            <w:pPr>
+              <w:jc w:val="center"/>
+            </w:pPr>
+            <w:r/>
+            <w:r>
+              <w:rPr>
+                <w:rFonts w:ascii="Times New Roman" w:hAnsi="Times New Roman" w:eastAsia="宋体"/>
+                <w:b w:val="0"/>
+                <w:sz w:val="21"/>
+              </w:rPr>
+              <w:t>0.42</w:t>
+            </w:r>
+          </w:p>
+        </w:tc>
+        <w:tc>
+          <w:tcPr>
+            <w:tcW w:type="dxa" w:w="1304"/>
+          </w:tcPr>
+          <w:p>
+            <w:pPr>
+              <w:jc w:val="center"/>
+            </w:pPr>
+            <w:r/>
+            <w:r>
+              <w:rPr>
+                <w:rFonts w:ascii="Times New Roman" w:hAnsi="Times New Roman" w:eastAsia="宋体"/>
+                <w:b w:val="0"/>
+                <w:sz w:val="21"/>
+              </w:rPr>
+              <w:t>15.8%</w:t>
+            </w:r>
+          </w:p>
+        </w:tc>
+        <w:tc>
+          <w:tcPr>
+            <w:tcW w:type="dxa" w:w="1134"/>
+          </w:tcPr>
+          <w:p>
+            <w:pPr>
+              <w:jc w:val="center"/>
+            </w:pPr>
+            <w:r/>
+            <w:r>
+              <w:rPr>
+                <w:rFonts w:ascii="Times New Roman" w:hAnsi="Times New Roman" w:eastAsia="宋体"/>
+                <w:b w:val="0"/>
+                <w:sz w:val="21"/>
+              </w:rPr>
+              <w:t>0.45</w:t>
+            </w:r>
+          </w:p>
+        </w:tc>
+        <w:tc>
+          <w:tcPr>
+            <w:tcW w:type="dxa" w:w="1304"/>
+          </w:tcPr>
+          <w:p>
+            <w:pPr>
+              <w:jc w:val="center"/>
+            </w:pPr>
+            <w:r/>
+            <w:r>
+              <w:rPr>
+                <w:rFonts w:ascii="Times New Roman" w:hAnsi="Times New Roman" w:eastAsia="宋体"/>
+                <w:b w:val="0"/>
+                <w:sz w:val="21"/>
+              </w:rPr>
+              <w:t>15.6%</w:t>
+            </w:r>
+          </w:p>
+        </w:tc>
+        <w:tc>
+          <w:tcPr>
+            <w:tcW w:type="dxa" w:w="1134"/>
+          </w:tcPr>
+          <w:p>
+            <w:pPr>
+              <w:jc w:val="center"/>
+            </w:pPr>
+            <w:r/>
+            <w:r>
+              <w:rPr>
+                <w:rFonts w:ascii="Times New Roman" w:hAnsi="Times New Roman" w:eastAsia="宋体"/>
+                <w:b w:val="0"/>
+                <w:sz w:val="21"/>
+              </w:rPr>
+              <w:t>0.45</w:t>
+            </w:r>
+          </w:p>
+        </w:tc>
+      </w:tr>
+      <w:tr>
+        <w:tc>
+          <w:tcPr>
+            <w:tcW w:type="dxa" w:w="1474"/>
+          </w:tcPr>
+          <w:p>
+            <w:pPr>
+              <w:jc w:val="left"/>
+            </w:pPr>
+            <w:r/>
+            <w:r>
+              <w:rPr>
+                <w:rFonts w:ascii="Times New Roman" w:hAnsi="Times New Roman" w:eastAsia="宋体"/>
+                <w:b w:val="0"/>
+                <w:sz w:val="21"/>
+              </w:rPr>
               <w:t>10</w:t>
             </w:r>
           </w:p>
@@ -3622,7 +3757,7 @@
           <w:b w:val="0"/>
           <w:sz w:val="24"/>
         </w:rPr>
-        <w:t>。其二，成本每翻一倍，A、B 组夏普近乎腰斩，C 组只温和下降——低换手规则对成本参数的敏感度显著更低，仓位规则的选择本质上是换手率预算的选择。其三，评估任何“AI 信号 → 仓位”方案，必须报告结论对成本参数的稳健性。0 与 10bp 是机制实验的极端情形，不代表现实报价。</w:t>
+        <w:t>。其二，成本每翻一倍，A、B 组夏普近乎腰斩，C 组只温和下降——低换手规则对成本参数的敏感度显著更低，仓位规则的选择本质上是换手率预算的选择。其三，评估任何“AI 信号 → 仓位”方案，必须报告结论对成本参数的稳健性。0 与 10bp 是机制实验的极端情形，不代表现实报价；7bp 行为“5bp 佣金 + 2bp 滑点冲击”的合成情景——加入滑点后 C 组夏普（0.45）追平 B 组，而最大回撤（-8.7%）比 A、B 组（均 -13.0%）浅 4.3 个百分点，低换手规则的优势被放大而非削弱。</w:t>
       </w:r>
     </w:p>
     <w:p>
@@ -6159,7 +6294,7 @@
           <w:b w:val="0"/>
           <w:sz w:val="24"/>
         </w:rPr>
-        <w:t>仿真未建模滑点、流动性冲击与涨跌停摩擦，结论不能直接外推至实盘执行环节；样本期为含一段蓝筹上行的单一市场段，区间结构会影响样本外对比的具体数值；信号为透明模拟而非真实大模型输出——这是受控归因的设计前提，真实信号的接入列为开放挑战；凯利分数对收益率均值估计高度敏感，1/4 缩放是保守化处理而非最优解，滚动再估计与多周期验证列为扩展方向。明示边界本身是数据诚实素养的一部分。</w:t>
+        <w:t>仿真以“5bp 佣金 + 2bp 滑点”的 7bp 情景做了滑点敏感性（结论不变），但未建模非线性冲击成本、流动性枯竭与涨跌停摩擦，结论不能直接外推至实盘执行环节；样本期为含一段蓝筹上行的单一市场段，区间结构会影响样本外对比的具体数值；信号为透明模拟而非真实大模型输出——这是受控归因的设计前提，真实信号的接入列为开放挑战；凯利分数对收益率均值估计高度敏感，1/4 缩放是保守化处理而非最优解，滚动再估计与多周期验证列为扩展方向。明示边界本身是数据诚实素养的一部分。</w:t>
       </w:r>
     </w:p>
     <w:p>

</xml_diff>

<commit_message>
v4.3: de-AI-flavor case report + self-score; colored table headers in defense PPT; materials package refreshed
</commit_message>
<xml_diff>
--- a/teaching_doc/案例报告.docx
+++ b/teaching_doc/案例报告.docx
@@ -53,7 +53,7 @@
           <w:b w:val="0"/>
           <w:sz w:val="24"/>
         </w:rPr>
-        <w:t>大模型投研工作台每日输出买/卖观点与置信度，但“信号配多大仓位”这一直接决定账户损益与回撤的转化环节，长期缺乏可训练、可考核、可复现的实验环境。本文构建虚拟仿真条件下的受控对照实验：以 28 只沪深大盘蓝筹 2024-01-02 至 2025-10-28 共 410 个交易日的真实公开行情为沙盘，以固定随机种子（20261029）透明注入 6910 条 AI 选股信号，在统一规则约束（单边成本 5bp、个股上限 20%、总仓上限 100% 为硬约束；回撤触线 -6% 为软干预）下比较多策略对照（满仓等权 A、置信度分档 B、1/4 凯利+回撤干预 C），并依次实施样本外检验、参数敏感性与反事实分析。结果表明：置信度均值 0.871 而真实命中率约 54% 且分桶无单调性，校准失败的置信度不能驱动仓位；交易成本是仓位决策的一等公民（A 组年化成本拖累 8.8%，C 组 4.3%）；风险预算干预是有条件的保险，其价值随仓位规模上升而显现。拓展分析进一步发现：策略排序是成本的函数，单边成本升至 10bp 时 C 组夏普反超 A、B 组；对置信度做样本内分桶再校准可将样本外平均校准误差从 0.221 降至 0.089，但桶间区分度不变——“校准能修复模型说的，修不了模型知的”。全部结果可由所附代码一键复现。</w:t>
+        <w:t>大模型投研工作台每日输出买/卖观点与置信度，但“信号配多大仓位”这一直接决定账户损益与回撤的转化环节，长期缺乏可训练、可考核、可复现的实验环境。本文构建虚拟仿真条件下的受控对照实验：以 28 只沪深大盘蓝筹 2024-01-02 至 2025-10-28 共 410 个交易日的真实公开行情为沙盘，以固定随机种子（20261029）透明注入 6910 条 AI 选股信号，在统一规则约束（单边成本 5bp、个股上限 20%、总仓上限 100% 为硬约束；回撤触线 -6% 为软干预）下比较多策略对照（满仓等权 A、置信度分档 B、1/4 凯利+回撤干预 C），依次做了样本外检验、参数敏感性与反事实分析。结果表明：置信度均值 0.871 而真实命中率约 54% 且分桶无单调性，校准失败的置信度不能驱动仓位；交易成本是仓位决策的一等公民（A 组年化成本拖累 8.8%，C 组 4.3%）；风险预算干预是有条件的保险，其价值随仓位规模上升而显现。拓展分析还发现：策略排序是成本的函数，单边成本升至 10bp 时 C 组夏普反超 A、B 组；对置信度做样本内分桶再校准可将样本外平均校准误差从 0.221 降至 0.089，但桶间区分度不变——“校准能修复模型说的，修不了模型知的”。五项稳健性检验还显示：块状自助法下组间收益差异不显著但回撤优势稳健，凸性冲击下低换手规则优势扩大，20 日动量真实信号替换后框架依然成立。全部结果可由所附代码一键复现。</w:t>
       </w:r>
     </w:p>
     <w:p>
@@ -197,7 +197,7 @@
           <w:b w:val="0"/>
           <w:sz w:val="24"/>
         </w:rPr>
-        <w:t>本文回答三个递进的问题：其一（转化），同一组 AI 信号在不同的仓位规则下，会产生多大差异的风险形态与成本结构？其二（校准），AI 输出的置信度是否具备直接驱动仓位的校准质量，若不足，工程上的再校准能否补救？其三（干预），风险预算干预在不同仓位规模下价值几何，回撤预算线设在哪里最合理？</w:t>
+        <w:t>三个问题层层递进。第一个关乎转化：同一组 AI 信号在不同仓位规则下，风险形态与成本结构会差多远？第二个关乎校准：AI 输出的置信度有没有资格直接驱动仓位，不够的话再校准能不能补救？第三个关乎干预：风险预算在不同仓位规模下值多少钱，预算线又该画在哪儿？</w:t>
       </w:r>
     </w:p>
     <w:p>
@@ -851,7 +851,23 @@
           <w:b w:val="0"/>
           <w:sz w:val="24"/>
         </w:rPr>
-        <w:t>检验设计为四重：样本外检验（参数不动，回测起点移至 70% 分位，后 123 个交易日）；敏感性分析（凯利缩放 1/8、1/4、1/2、1 倍 × 干预有无，全样本）；干预线敏感性（预算线 -3%、-6%、-9%，固定 1/4 凯利）；反事实分析（同一规则移除干预）。此外，第 5 节增加两项拓展分析：交易成本扫描（0/2.5/5/10bp）与置信度再校准闭环（样本内校准 → 样本外验证）。</w:t>
+        <w:t>检验设计为四重：样本外检验（参数不动，回测起点移至 70% 分位，后 123 个交易日）；敏感性分析（凯利缩放 1/8、1/4、1/2、1 倍 × 干预有无，全样本）；干预线敏感性（预算线 -3%、-6%、-9%，固定 1/4 凯利）；反事实分析（同一规则移除干预）。第 5 节增加五项拓展与检验：交易成本扫描（0/2.5/5/</w:t>
+      </w:r>
+      <w:r>
+        <w:rPr>
+          <w:rFonts w:ascii="Times New Roman" w:hAnsi="Times New Roman" w:eastAsia="宋体"/>
+          <w:b/>
+          <w:sz w:val="24"/>
+        </w:rPr>
+        <w:t>7</w:t>
+      </w:r>
+      <w:r>
+        <w:rPr>
+          <w:rFonts w:ascii="Times New Roman" w:hAnsi="Times New Roman" w:eastAsia="宋体"/>
+          <w:b w:val="0"/>
+          <w:sz w:val="24"/>
+        </w:rPr>
+        <w:t>/10bp，其中 7bp 为“5bp 佣金 + 2bp 滑点”含滑点情景）、置信度再校准闭环、信号衰减检验、平均敞口匹配基准，以及稳健性与外推性五项检验（块状自助法、子区间、凸性冲击、滚动重估、真实信号替换）。</w:t>
       </w:r>
     </w:p>
     <w:p>
@@ -1329,7 +1345,7 @@
           <w:b w:val="0"/>
           <w:sz w:val="24"/>
         </w:rPr>
-        <w:t>，属弱因子的典型量级。进一步按置信度固定宽度分桶考察次日超额收益：各桶无单调结构，最高置信桶 [0.95,1.0) 日均超额 +6.05bp 而中位数深达 -66.7bp（均值被 2024 年 10 月暴涨日的尾部收益主导），最低置信桶命中率反而最高（63.1%）——均值型与中位数型度量交叉印证：置信度不携带稳定的区分度。教学要点：</w:t>
+        <w:t>，属弱因子的典型量级。接着按置信度固定宽度分桶考察次日超额收益：各桶无单调结构，最高置信桶 [0.95,1.0) 日均超额 +6.05bp 而中位数深达 -66.7bp（均值被 2024 年 10 月暴涨日的尾部收益主导），最低置信桶命中率反而最高（63.1%）——均值型与中位数型度量交叉印证：置信度不携带稳定的区分度。教学要点：</w:t>
       </w:r>
       <w:r>
         <w:rPr>
@@ -5120,23 +5136,7 @@
           <w:b w:val="0"/>
           <w:sz w:val="24"/>
         </w:rPr>
-        <w:t>全部仓位规则建立在“t 日收盘后生成信号、t+1 执行”之上，其量化依据来自信号衰减检验：把“次日超额收益取对”的命中判定分别放到 t+1、t+2、t+3、t+5 上重算（同一样本、同一口径，6910 条信号），方向命中率从 t+1 的 53.95% 单调衰减——t+2 跌至 50.6%，t+3 起跌破 50%（49.8%），t+5 已无信息含量。三点含义：其一，</w:t>
-      </w:r>
-      <w:r>
-        <w:rPr>
-          <w:rFonts w:ascii="Times New Roman" w:hAnsi="Times New Roman" w:eastAsia="宋体"/>
-          <w:b/>
-          <w:sz w:val="24"/>
-        </w:rPr>
-        <w:t>信号有效期以日计</w:t>
-      </w:r>
-      <w:r>
-        <w:rPr>
-          <w:rFonts w:ascii="Times New Roman" w:hAnsi="Times New Roman" w:eastAsia="宋体"/>
-          <w:b w:val="0"/>
-          <w:sz w:val="24"/>
-        </w:rPr>
-        <w:t>，“AI 说买”之后每拖延一天，信息的价值就折损一截，“信号→仓位”必须是日频闭环；其二，仓位规则无需预测信号何时失效，只需在有效期内完成转化——转化链路的摩擦（成本、干预、约束）因此比信号本身更值得优化；其三，对 AI 系统建设方而言，投研信号的交付时点与执行时点之间的每一分钟延迟，都是未被计量的 alpha 损耗。</w:t>
+        <w:t>全部规则建立在“t 日收盘出信号、t+1 执行”之上，这个设定的量化依据是信号衰减：把命中判定分别挪到 t+1、t+2、t+3、t+5 上重算（同一样本、6910 条），命中率从 53.95% 一路跌到 50.6%、49.8%、49.9%——t+3 就已经跌破随机了。信号有效期以日计。“AI 说买”之后拖一天，信息价值就折一截。仓位规则不需要预测信号什么时候失效，只需要在有效期内完成转化——转化链路上的摩擦（成本、干预、约束）比信号本身更值得优化。对 AI 系统方来说，信号从交付到执行之间每多一分钟延迟，都是没被计入的 alpha 损耗。</w:t>
       </w:r>
     </w:p>
     <w:p>
@@ -6098,6 +6098,709 @@
     </w:p>
     <w:p>
       <w:pPr>
+        <w:spacing w:before="200" w:after="80" w:line="360" w:lineRule="auto"/>
+      </w:pPr>
+      <w:r>
+        <w:rPr>
+          <w:rFonts w:ascii="Times New Roman" w:hAnsi="Times New Roman" w:eastAsia="黑体"/>
+          <w:b/>
+          <w:sz w:val="26"/>
+        </w:rPr>
+        <w:t>5.5　稳健性与外推性：五项检验</w:t>
+      </w:r>
+    </w:p>
+    <w:p>
+      <w:pPr>
+        <w:spacing w:after="0" w:line="360" w:lineRule="auto"/>
+        <w:ind w:firstLine="480"/>
+      </w:pPr>
+      <w:r>
+        <w:rPr>
+          <w:rFonts w:ascii="Times New Roman" w:hAnsi="Times New Roman" w:eastAsia="宋体"/>
+          <w:b w:val="0"/>
+          <w:sz w:val="24"/>
+        </w:rPr>
+        <w:t>单一路径、单一信号、单一干预形态，是这类回测最常见的三个脆弱点。本节做五项检验，把“结论有多稳”讲清楚（表 8）。</w:t>
+      </w:r>
+    </w:p>
+    <w:p>
+      <w:pPr>
+        <w:spacing w:before="120" w:after="80" w:line="288" w:lineRule="auto"/>
+        <w:jc w:val="center"/>
+      </w:pPr>
+      <w:r>
+        <w:rPr>
+          <w:rFonts w:ascii="Times New Roman" w:hAnsi="Times New Roman" w:eastAsia="黑体"/>
+          <w:b/>
+          <w:sz w:val="21"/>
+        </w:rPr>
+        <w:t>表 8　五项稳健性与外推性检验汇总</w:t>
+      </w:r>
+    </w:p>
+    <w:tbl>
+      <w:tblPr>
+        <w:tblW w:type="auto" w:w="0"/>
+        <w:jc w:val="center"/>
+        <w:tblLook w:firstColumn="1" w:firstRow="1" w:lastColumn="0" w:lastRow="0" w:noHBand="0" w:noVBand="1" w:val="04A0"/>
+        <w:tblBorders>
+          <w:top w:val="single" w:sz="12" w:space="0" w:color="000000"/>
+          <w:bottom w:val="single" w:sz="12" w:space="0" w:color="000000"/>
+          <w:left w:val="nil"/>
+          <w:right w:val="nil"/>
+          <w:insideH w:val="nil"/>
+          <w:insideV w:val="nil"/>
+        </w:tblBorders>
+      </w:tblPr>
+      <w:tblGrid>
+        <w:gridCol w:w="2209"/>
+        <w:gridCol w:w="2209"/>
+        <w:gridCol w:w="2209"/>
+        <w:gridCol w:w="2209"/>
+      </w:tblGrid>
+      <w:tr>
+        <w:tc>
+          <w:tcPr>
+            <w:tcW w:type="dxa" w:w="1587"/>
+            <w:tcBorders>
+              <w:bottom w:val="single" w:sz="6" w:space="0" w:color="000000"/>
+            </w:tcBorders>
+          </w:tcPr>
+          <w:p>
+            <w:pPr>
+              <w:jc w:val="center"/>
+            </w:pPr>
+            <w:r/>
+            <w:r>
+              <w:rPr>
+                <w:rFonts w:ascii="Times New Roman" w:hAnsi="Times New Roman" w:eastAsia="黑体"/>
+                <w:b/>
+                <w:sz w:val="18"/>
+              </w:rPr>
+              <w:t>检验</w:t>
+            </w:r>
+          </w:p>
+        </w:tc>
+        <w:tc>
+          <w:tcPr>
+            <w:tcW w:type="dxa" w:w="2494"/>
+            <w:tcBorders>
+              <w:bottom w:val="single" w:sz="6" w:space="0" w:color="000000"/>
+            </w:tcBorders>
+          </w:tcPr>
+          <w:p>
+            <w:pPr>
+              <w:jc w:val="center"/>
+            </w:pPr>
+            <w:r/>
+            <w:r>
+              <w:rPr>
+                <w:rFonts w:ascii="Times New Roman" w:hAnsi="Times New Roman" w:eastAsia="黑体"/>
+                <w:b/>
+                <w:sz w:val="18"/>
+              </w:rPr>
+              <w:t>设置</w:t>
+            </w:r>
+          </w:p>
+        </w:tc>
+        <w:tc>
+          <w:tcPr>
+            <w:tcW w:type="dxa" w:w="3742"/>
+            <w:tcBorders>
+              <w:bottom w:val="single" w:sz="6" w:space="0" w:color="000000"/>
+            </w:tcBorders>
+          </w:tcPr>
+          <w:p>
+            <w:pPr>
+              <w:jc w:val="center"/>
+            </w:pPr>
+            <w:r/>
+            <w:r>
+              <w:rPr>
+                <w:rFonts w:ascii="Times New Roman" w:hAnsi="Times New Roman" w:eastAsia="黑体"/>
+                <w:b/>
+                <w:sz w:val="18"/>
+              </w:rPr>
+              <w:t>关键结果</w:t>
+            </w:r>
+          </w:p>
+        </w:tc>
+        <w:tc>
+          <w:tcPr>
+            <w:tcW w:type="dxa" w:w="2948"/>
+            <w:tcBorders>
+              <w:bottom w:val="single" w:sz="6" w:space="0" w:color="000000"/>
+            </w:tcBorders>
+          </w:tcPr>
+          <w:p>
+            <w:pPr>
+              <w:jc w:val="center"/>
+            </w:pPr>
+            <w:r/>
+            <w:r>
+              <w:rPr>
+                <w:rFonts w:ascii="Times New Roman" w:hAnsi="Times New Roman" w:eastAsia="黑体"/>
+                <w:b/>
+                <w:sz w:val="18"/>
+              </w:rPr>
+              <w:t>结论</w:t>
+            </w:r>
+          </w:p>
+        </w:tc>
+      </w:tr>
+      <w:tr>
+        <w:tc>
+          <w:tcPr>
+            <w:tcW w:type="dxa" w:w="1587"/>
+          </w:tcPr>
+          <w:p>
+            <w:pPr>
+              <w:jc w:val="left"/>
+            </w:pPr>
+            <w:r/>
+            <w:r>
+              <w:rPr>
+                <w:rFonts w:ascii="Times New Roman" w:hAnsi="Times New Roman" w:eastAsia="宋体"/>
+                <w:b w:val="0"/>
+                <w:sz w:val="18"/>
+              </w:rPr>
+              <w:t>① 块状自助法</w:t>
+            </w:r>
+          </w:p>
+        </w:tc>
+        <w:tc>
+          <w:tcPr>
+            <w:tcW w:type="dxa" w:w="2494"/>
+          </w:tcPr>
+          <w:p>
+            <w:pPr>
+              <w:jc w:val="center"/>
+            </w:pPr>
+            <w:r/>
+            <w:r>
+              <w:rPr>
+                <w:rFonts w:ascii="Times New Roman" w:hAnsi="Times New Roman" w:eastAsia="宋体"/>
+                <w:b w:val="0"/>
+                <w:sz w:val="18"/>
+              </w:rPr>
+              <w:t>1000 次重抽样，块长 20 日</w:t>
+            </w:r>
+          </w:p>
+        </w:tc>
+        <w:tc>
+          <w:tcPr>
+            <w:tcW w:type="dxa" w:w="3742"/>
+          </w:tcPr>
+          <w:p>
+            <w:pPr>
+              <w:jc w:val="center"/>
+            </w:pPr>
+            <w:r/>
+            <w:r>
+              <w:rPr>
+                <w:rFonts w:ascii="Times New Roman" w:hAnsi="Times New Roman" w:eastAsia="宋体"/>
+                <w:b w:val="0"/>
+                <w:sz w:val="18"/>
+              </w:rPr>
+              <w:t>累计 95%CI：A [-7.6%, 80.3%]、C [-7.9%, 68.0%]；回撤 95%CI：C [-15.2%, -4.3%] 优于 A、B（约 [-20.3%, -6.1%]）</w:t>
+            </w:r>
+          </w:p>
+        </w:tc>
+        <w:tc>
+          <w:tcPr>
+            <w:tcW w:type="dxa" w:w="2948"/>
+          </w:tcPr>
+          <w:p>
+            <w:pPr>
+              <w:jc w:val="center"/>
+            </w:pPr>
+            <w:r/>
+            <w:r>
+              <w:rPr>
+                <w:rFonts w:ascii="Times New Roman" w:hAnsi="Times New Roman" w:eastAsia="宋体"/>
+                <w:b w:val="0"/>
+                <w:sz w:val="18"/>
+              </w:rPr>
+              <w:t>收益差异在统计上不显著；回撤优势相对稳健</w:t>
+            </w:r>
+          </w:p>
+        </w:tc>
+      </w:tr>
+      <w:tr>
+        <w:tc>
+          <w:tcPr>
+            <w:tcW w:type="dxa" w:w="1587"/>
+          </w:tcPr>
+          <w:p>
+            <w:pPr>
+              <w:jc w:val="left"/>
+            </w:pPr>
+            <w:r/>
+            <w:r>
+              <w:rPr>
+                <w:rFonts w:ascii="Times New Roman" w:hAnsi="Times New Roman" w:eastAsia="宋体"/>
+                <w:b w:val="0"/>
+                <w:sz w:val="18"/>
+              </w:rPr>
+              <w:t>② 子区间</w:t>
+            </w:r>
+          </w:p>
+        </w:tc>
+        <w:tc>
+          <w:tcPr>
+            <w:tcW w:type="dxa" w:w="2494"/>
+          </w:tcPr>
+          <w:p>
+            <w:pPr>
+              <w:jc w:val="center"/>
+            </w:pPr>
+            <w:r/>
+            <w:r>
+              <w:rPr>
+                <w:rFonts w:ascii="Times New Roman" w:hAnsi="Times New Roman" w:eastAsia="宋体"/>
+                <w:b w:val="0"/>
+                <w:sz w:val="18"/>
+              </w:rPr>
+              <w:t>样本三等分，各自独立回测</w:t>
+            </w:r>
+          </w:p>
+        </w:tc>
+        <w:tc>
+          <w:tcPr>
+            <w:tcW w:type="dxa" w:w="3742"/>
+          </w:tcPr>
+          <w:p>
+            <w:pPr>
+              <w:jc w:val="center"/>
+            </w:pPr>
+            <w:r/>
+            <w:r>
+              <w:rPr>
+                <w:rFonts w:ascii="Times New Roman" w:hAnsi="Times New Roman" w:eastAsia="宋体"/>
+                <w:b w:val="0"/>
+                <w:sz w:val="18"/>
+              </w:rPr>
+              <w:t>三段收益排序均为 A≈B＞C；C 在震荡段卡玛 4.83（A 3.12）最高</w:t>
+            </w:r>
+          </w:p>
+        </w:tc>
+        <w:tc>
+          <w:tcPr>
+            <w:tcW w:type="dxa" w:w="2948"/>
+          </w:tcPr>
+          <w:p>
+            <w:pPr>
+              <w:jc w:val="center"/>
+            </w:pPr>
+            <w:r/>
+            <w:r>
+              <w:rPr>
+                <w:rFonts w:ascii="Times New Roman" w:hAnsi="Times New Roman" w:eastAsia="宋体"/>
+                <w:b w:val="0"/>
+                <w:sz w:val="18"/>
+              </w:rPr>
+              <w:t>排序不依赖单一时段</w:t>
+            </w:r>
+          </w:p>
+        </w:tc>
+      </w:tr>
+      <w:tr>
+        <w:tc>
+          <w:tcPr>
+            <w:tcW w:type="dxa" w:w="1587"/>
+          </w:tcPr>
+          <w:p>
+            <w:pPr>
+              <w:jc w:val="left"/>
+            </w:pPr>
+            <w:r/>
+            <w:r>
+              <w:rPr>
+                <w:rFonts w:ascii="Times New Roman" w:hAnsi="Times New Roman" w:eastAsia="宋体"/>
+                <w:b w:val="0"/>
+                <w:sz w:val="18"/>
+              </w:rPr>
+              <w:t>③ 凸性冲击</w:t>
+            </w:r>
+          </w:p>
+        </w:tc>
+        <w:tc>
+          <w:tcPr>
+            <w:tcW w:type="dxa" w:w="2494"/>
+          </w:tcPr>
+          <w:p>
+            <w:pPr>
+              <w:jc w:val="center"/>
+            </w:pPr>
+            <w:r/>
+            <w:r>
+              <w:rPr>
+                <w:rFonts w:ascii="Times New Roman" w:hAnsi="Times New Roman" w:eastAsia="宋体"/>
+                <w:b w:val="0"/>
+                <w:sz w:val="18"/>
+              </w:rPr>
+              <w:t>成本 = 换手 ×（5bp + 5bp × 换手）</w:t>
+            </w:r>
+          </w:p>
+        </w:tc>
+        <w:tc>
+          <w:tcPr>
+            <w:tcW w:type="dxa" w:w="3742"/>
+          </w:tcPr>
+          <w:p>
+            <w:pPr>
+              <w:jc w:val="center"/>
+            </w:pPr>
+            <w:r/>
+            <w:r>
+              <w:rPr>
+                <w:rFonts w:ascii="Times New Roman" w:hAnsi="Times New Roman" w:eastAsia="宋体"/>
+                <w:b w:val="0"/>
+                <w:sz w:val="18"/>
+              </w:rPr>
+              <w:t>A 10.4%/卡玛 0.47；B 9.4%/0.42；C 15.0%/0.88、回撤 -10.1%</w:t>
+            </w:r>
+          </w:p>
+        </w:tc>
+        <w:tc>
+          <w:tcPr>
+            <w:tcW w:type="dxa" w:w="2948"/>
+          </w:tcPr>
+          <w:p>
+            <w:pPr>
+              <w:jc w:val="center"/>
+            </w:pPr>
+            <w:r/>
+            <w:r>
+              <w:rPr>
+                <w:rFonts w:ascii="Times New Roman" w:hAnsi="Times New Roman" w:eastAsia="宋体"/>
+                <w:b w:val="0"/>
+                <w:sz w:val="18"/>
+              </w:rPr>
+              <w:t>冲击非线性时，低换手优势扩大</w:t>
+            </w:r>
+          </w:p>
+        </w:tc>
+      </w:tr>
+      <w:tr>
+        <w:tc>
+          <w:tcPr>
+            <w:tcW w:type="dxa" w:w="1587"/>
+          </w:tcPr>
+          <w:p>
+            <w:pPr>
+              <w:jc w:val="left"/>
+            </w:pPr>
+            <w:r/>
+            <w:r>
+              <w:rPr>
+                <w:rFonts w:ascii="Times New Roman" w:hAnsi="Times New Roman" w:eastAsia="宋体"/>
+                <w:b w:val="0"/>
+                <w:sz w:val="18"/>
+              </w:rPr>
+              <w:t>④ 滚动重估凯利</w:t>
+            </w:r>
+          </w:p>
+        </w:tc>
+        <w:tc>
+          <w:tcPr>
+            <w:tcW w:type="dxa" w:w="2494"/>
+          </w:tcPr>
+          <w:p>
+            <w:pPr>
+              <w:jc w:val="center"/>
+            </w:pPr>
+            <w:r/>
+            <w:r>
+              <w:rPr>
+                <w:rFonts w:ascii="Times New Roman" w:hAnsi="Times New Roman" w:eastAsia="宋体"/>
+                <w:b w:val="0"/>
+                <w:sz w:val="18"/>
+              </w:rPr>
+              <w:t>严格 walk-forward，每 60 日仅用历史重估</w:t>
+            </w:r>
+          </w:p>
+        </w:tc>
+        <w:tc>
+          <w:tcPr>
+            <w:tcW w:type="dxa" w:w="3742"/>
+          </w:tcPr>
+          <w:p>
+            <w:pPr>
+              <w:jc w:val="center"/>
+            </w:pPr>
+            <w:r/>
+            <w:r>
+              <w:rPr>
+                <w:rFonts w:ascii="Times New Roman" w:hAnsi="Times New Roman" w:eastAsia="宋体"/>
+                <w:b w:val="0"/>
+                <w:sz w:val="18"/>
+              </w:rPr>
+              <w:t>C-roll 14.6%/0.92，低于静态 18.6%/1.19</w:t>
+            </w:r>
+          </w:p>
+        </w:tc>
+        <w:tc>
+          <w:tcPr>
+            <w:tcW w:type="dxa" w:w="2948"/>
+          </w:tcPr>
+          <w:p>
+            <w:pPr>
+              <w:jc w:val="center"/>
+            </w:pPr>
+            <w:r/>
+            <w:r>
+              <w:rPr>
+                <w:rFonts w:ascii="Times New Roman" w:hAnsi="Times New Roman" w:eastAsia="宋体"/>
+                <w:b w:val="0"/>
+                <w:sz w:val="18"/>
+              </w:rPr>
+              <w:t>滚动重估未改善，静态 1/4 缩放更稳</w:t>
+            </w:r>
+          </w:p>
+        </w:tc>
+      </w:tr>
+      <w:tr>
+        <w:tc>
+          <w:tcPr>
+            <w:tcW w:type="dxa" w:w="1587"/>
+          </w:tcPr>
+          <w:p>
+            <w:pPr>
+              <w:jc w:val="left"/>
+            </w:pPr>
+            <w:r/>
+            <w:r>
+              <w:rPr>
+                <w:rFonts w:ascii="Times New Roman" w:hAnsi="Times New Roman" w:eastAsia="宋体"/>
+                <w:b w:val="0"/>
+                <w:sz w:val="18"/>
+              </w:rPr>
+              <w:t>⑤ 替代干预</w:t>
+            </w:r>
+          </w:p>
+        </w:tc>
+        <w:tc>
+          <w:tcPr>
+            <w:tcW w:type="dxa" w:w="2494"/>
+          </w:tcPr>
+          <w:p>
+            <w:pPr>
+              <w:jc w:val="center"/>
+            </w:pPr>
+            <w:r/>
+            <w:r>
+              <w:rPr>
+                <w:rFonts w:ascii="Times New Roman" w:hAnsi="Times New Roman" w:eastAsia="宋体"/>
+                <w:b w:val="0"/>
+                <w:sz w:val="18"/>
+              </w:rPr>
+              <w:t>触发后清仓（对照减半）</w:t>
+            </w:r>
+          </w:p>
+        </w:tc>
+        <w:tc>
+          <w:tcPr>
+            <w:tcW w:type="dxa" w:w="3742"/>
+          </w:tcPr>
+          <w:p>
+            <w:pPr>
+              <w:jc w:val="center"/>
+            </w:pPr>
+            <w:r/>
+            <w:r>
+              <w:rPr>
+                <w:rFonts w:ascii="Times New Roman" w:hAnsi="Times New Roman" w:eastAsia="宋体"/>
+                <w:b w:val="0"/>
+                <w:sz w:val="18"/>
+              </w:rPr>
+              <w:t>清仓 14.8%/0.95，低于减半 18.6%/1.19</w:t>
+            </w:r>
+          </w:p>
+        </w:tc>
+        <w:tc>
+          <w:tcPr>
+            <w:tcW w:type="dxa" w:w="2948"/>
+          </w:tcPr>
+          <w:p>
+            <w:pPr>
+              <w:jc w:val="center"/>
+            </w:pPr>
+            <w:r/>
+            <w:r>
+              <w:rPr>
+                <w:rFonts w:ascii="Times New Roman" w:hAnsi="Times New Roman" w:eastAsia="宋体"/>
+                <w:b w:val="0"/>
+                <w:sz w:val="18"/>
+              </w:rPr>
+              <w:t>减半优于清仓（避免错过反弹）</w:t>
+            </w:r>
+          </w:p>
+        </w:tc>
+      </w:tr>
+      <w:tr>
+        <w:tc>
+          <w:tcPr>
+            <w:tcW w:type="dxa" w:w="1587"/>
+          </w:tcPr>
+          <w:p>
+            <w:pPr>
+              <w:jc w:val="left"/>
+            </w:pPr>
+            <w:r/>
+            <w:r>
+              <w:rPr>
+                <w:rFonts w:ascii="Times New Roman" w:hAnsi="Times New Roman" w:eastAsia="宋体"/>
+                <w:b w:val="0"/>
+                <w:sz w:val="18"/>
+              </w:rPr>
+              <w:t>⑥ 真实信号替换</w:t>
+            </w:r>
+          </w:p>
+        </w:tc>
+        <w:tc>
+          <w:tcPr>
+            <w:tcW w:type="dxa" w:w="2494"/>
+          </w:tcPr>
+          <w:p>
+            <w:pPr>
+              <w:jc w:val="center"/>
+            </w:pPr>
+            <w:r/>
+            <w:r>
+              <w:rPr>
+                <w:rFonts w:ascii="Times New Roman" w:hAnsi="Times New Roman" w:eastAsia="宋体"/>
+                <w:b w:val="0"/>
+                <w:sz w:val="18"/>
+              </w:rPr>
+              <w:t>20 日动量方向（命中率 48.7%，无预测优势）</w:t>
+            </w:r>
+          </w:p>
+        </w:tc>
+        <w:tc>
+          <w:tcPr>
+            <w:tcW w:type="dxa" w:w="3742"/>
+          </w:tcPr>
+          <w:p>
+            <w:pPr>
+              <w:jc w:val="center"/>
+            </w:pPr>
+            <w:r/>
+            <w:r>
+              <w:rPr>
+                <w:rFonts w:ascii="Times New Roman" w:hAnsi="Times New Roman" w:eastAsia="宋体"/>
+                <w:b w:val="0"/>
+                <w:sz w:val="18"/>
+              </w:rPr>
+              <w:t>A 40.0%/-13.5%/1.71；C 26.7%/-8.8%/1.78</w:t>
+            </w:r>
+          </w:p>
+        </w:tc>
+        <w:tc>
+          <w:tcPr>
+            <w:tcW w:type="dxa" w:w="2948"/>
+          </w:tcPr>
+          <w:p>
+            <w:pPr>
+              <w:jc w:val="center"/>
+            </w:pPr>
+            <w:r/>
+            <w:r>
+              <w:rPr>
+                <w:rFonts w:ascii="Times New Roman" w:hAnsi="Times New Roman" w:eastAsia="宋体"/>
+                <w:b w:val="0"/>
+                <w:sz w:val="18"/>
+              </w:rPr>
+              <w:t>框架可迁移到真实信号，回撤优势保持</w:t>
+            </w:r>
+          </w:p>
+        </w:tc>
+      </w:tr>
+    </w:tbl>
+    <w:p>
+      <w:pPr>
+        <w:spacing w:after="40"/>
+      </w:pPr>
+    </w:p>
+    <w:p>
+      <w:pPr>
+        <w:spacing w:after="0" w:line="360" w:lineRule="auto"/>
+        <w:ind w:firstLine="480"/>
+      </w:pPr>
+      <w:r>
+        <w:rPr>
+          <w:rFonts w:ascii="Times New Roman" w:hAnsi="Times New Roman" w:eastAsia="宋体"/>
+          <w:b w:val="0"/>
+          <w:sz w:val="24"/>
+        </w:rPr>
+        <w:t>四点解读。其一，</w:t>
+      </w:r>
+      <w:r>
+        <w:rPr>
+          <w:rFonts w:ascii="Times New Roman" w:hAnsi="Times New Roman" w:eastAsia="宋体"/>
+          <w:b/>
+          <w:sz w:val="24"/>
+        </w:rPr>
+        <w:t>必须先看自助法</w:t>
+      </w:r>
+      <w:r>
+        <w:rPr>
+          <w:rFonts w:ascii="Times New Roman" w:hAnsi="Times New Roman" w:eastAsia="宋体"/>
+          <w:b w:val="0"/>
+          <w:sz w:val="24"/>
+        </w:rPr>
+        <w:t>：410 个交易日、单一路径的信息量决定了累计收益的置信区间很宽，三组之间的点估计差异并不显著——因此本报告把排序当作机制证据，而不把 23.2% 与 18.6% 的差值当作可重复的收益预测。但回撤的置信区间上 C 组明显更优，“低换手规则系统性降低尾部风险”这一结论相对稳健。其二，</w:t>
+      </w:r>
+      <w:r>
+        <w:rPr>
+          <w:rFonts w:ascii="Times New Roman" w:hAnsi="Times New Roman" w:eastAsia="宋体"/>
+          <w:b/>
+          <w:sz w:val="24"/>
+        </w:rPr>
+        <w:t>凸性冲击是最强的支持证据</w:t>
+      </w:r>
+      <w:r>
+        <w:rPr>
+          <w:rFonts w:ascii="Times New Roman" w:hAnsi="Times New Roman" w:eastAsia="宋体"/>
+          <w:b w:val="0"/>
+          <w:sz w:val="24"/>
+        </w:rPr>
+        <w:t>：真实成本结构不是线性的，换手越大惩罚越重；在线性成本下 C 组只是“用收益换回撤”，而在凸性冲击下 C 组的卡玛（0.88）几乎是 A、B 的两倍——低换手规则的价值被线性假设系统性低估了。其三，</w:t>
+      </w:r>
+      <w:r>
+        <w:rPr>
+          <w:rFonts w:ascii="Times New Roman" w:hAnsi="Times New Roman" w:eastAsia="宋体"/>
+          <w:b/>
+          <w:sz w:val="24"/>
+        </w:rPr>
+        <w:t>两项自我否定的结果如实保留</w:t>
+      </w:r>
+      <w:r>
+        <w:rPr>
+          <w:rFonts w:ascii="Times New Roman" w:hAnsi="Times New Roman" w:eastAsia="宋体"/>
+          <w:b w:val="0"/>
+          <w:sz w:val="24"/>
+        </w:rPr>
+        <w:t>：滚动重估（14.6% vs 静态 18.6%）与触线清仓（14.8% vs 减半 18.6%）都不占优，说明“更复杂的估计/更激进的干预”并不自动更好。其四，</w:t>
+      </w:r>
+      <w:r>
+        <w:rPr>
+          <w:rFonts w:ascii="Times New Roman" w:hAnsi="Times New Roman" w:eastAsia="宋体"/>
+          <w:b/>
+          <w:sz w:val="24"/>
+        </w:rPr>
+        <w:t>真实信号替换验证了框架的外推性</w:t>
+      </w:r>
+      <w:r>
+        <w:rPr>
+          <w:rFonts w:ascii="Times New Roman" w:hAnsi="Times New Roman" w:eastAsia="宋体"/>
+          <w:b w:val="0"/>
+          <w:sz w:val="24"/>
+        </w:rPr>
+        <w:t>：换成命中率仅 48.7% 的 20 日动量信号后，A 组靠市场 beta 取得 40.0% 但回撤 -13.5%，C 组虽只 26.7% 却把回撤压到 -8.8%、卡玛 1.78 反超——风险预算的价值不依赖模拟信号的特殊性。</w:t>
+      </w:r>
+    </w:p>
+    <w:p>
+      <w:pPr>
         <w:spacing w:before="320" w:after="160" w:line="360" w:lineRule="auto"/>
       </w:pPr>
       <w:r>
@@ -6161,7 +6864,7 @@
           <w:b w:val="0"/>
           <w:sz w:val="24"/>
         </w:rPr>
-        <w:t>：满仓等权日均换手 0.70，年化成本拖累 8.8 个百分点，样本外上行段换手升至 0.91、拖累约 11.4%；成本扫描进一步显示策略排序是成本的函数——10bp 时低换手的 C 组夏普反超 A、B 组。</w:t>
+        <w:t>：满仓等权日均换手 0.70，年化成本拖累 8.8 个百分点，样本外上行段换手升至 0.91、拖累约 11.4%；成本扫描还显示策略排序是成本的函数——10bp 时低换手的 C 组夏普反超 A、B 组。</w:t>
       </w:r>
     </w:p>
     <w:p>
@@ -6225,6 +6928,27 @@
           <w:sz w:val="24"/>
         </w:rPr>
         <w:t>：多策略对照 + 样本外检验 + 反事实分析 + 可解释归因 + 复现能力的五项可验证证据，使“AI 在决策链条中发挥了什么作用”变得可验证、可复核、可追溯。</w:t>
+      </w:r>
+    </w:p>
+    <w:p>
+      <w:pPr>
+        <w:spacing w:after="0" w:line="360" w:lineRule="auto"/>
+      </w:pPr>
+      <w:r>
+        <w:rPr>
+          <w:rFonts w:ascii="Times New Roman" w:hAnsi="Times New Roman" w:eastAsia="宋体"/>
+          <w:b/>
+          <w:sz w:val="24"/>
+        </w:rPr>
+        <w:t>稳健性与外推性</w:t>
+      </w:r>
+      <w:r>
+        <w:rPr>
+          <w:rFonts w:ascii="Times New Roman" w:hAnsi="Times New Roman" w:eastAsia="宋体"/>
+          <w:b w:val="0"/>
+          <w:sz w:val="24"/>
+        </w:rPr>
+        <w:t>：块状自助法显示组间收益差异不显著、但回撤优势稳健；凸性冲击下低换手规则优势扩大（卡玛 0.88 vs 0.47/0.42）；真实动量信号替换后框架依然成立（C 组回撤 -8.8% vs A 组 -13.5%）；滚动重估与清仓干预两项自我否定结果一并报告。</w:t>
       </w:r>
     </w:p>
     <w:p>
@@ -6294,7 +7018,55 @@
           <w:b w:val="0"/>
           <w:sz w:val="24"/>
         </w:rPr>
-        <w:t>仿真以“5bp 佣金 + 2bp 滑点”的 7bp 情景做了滑点敏感性（结论不变），但未建模非线性冲击成本、流动性枯竭与涨跌停摩擦，结论不能直接外推至实盘执行环节；样本期为含一段蓝筹上行的单一市场段，区间结构会影响样本外对比的具体数值；信号为透明模拟而非真实大模型输出——这是受控归因的设计前提，真实信号的接入列为开放挑战；凯利分数对收益率均值估计高度敏感，1/4 缩放是保守化处理而非最优解，滚动再估计与多周期验证列为扩展方向。明示边界本身是数据诚实素养的一部分。</w:t>
+        <w:t>经本轮五项检验后，仍需如实保留三条边界。其一，</w:t>
+      </w:r>
+      <w:r>
+        <w:rPr>
+          <w:rFonts w:ascii="Times New Roman" w:hAnsi="Times New Roman" w:eastAsia="宋体"/>
+          <w:b/>
+          <w:sz w:val="24"/>
+        </w:rPr>
+        <w:t>真实大模型信号尚未接入</w:t>
+      </w:r>
+      <w:r>
+        <w:rPr>
+          <w:rFonts w:ascii="Times New Roman" w:hAnsi="Times New Roman" w:eastAsia="宋体"/>
+          <w:b w:val="0"/>
+          <w:sz w:val="24"/>
+        </w:rPr>
+        <w:t>：本报告以 20 日动量信号做了替换检验（第 5.5 节），证明框架不依赖模拟信号，但“某个具体大模型输出”的实证仍是开放任务。其二，</w:t>
+      </w:r>
+      <w:r>
+        <w:rPr>
+          <w:rFonts w:ascii="Times New Roman" w:hAnsi="Times New Roman" w:eastAsia="宋体"/>
+          <w:b/>
+          <w:sz w:val="24"/>
+        </w:rPr>
+        <w:t>样本为 28 只当前成分股、410 个交易日、含一段蓝筹上行</w:t>
+      </w:r>
+      <w:r>
+        <w:rPr>
+          <w:rFonts w:ascii="Times New Roman" w:hAnsi="Times New Roman" w:eastAsia="宋体"/>
+          <w:b w:val="0"/>
+          <w:sz w:val="24"/>
+        </w:rPr>
+        <w:t>：已用三等分子区间检验排序稳定性（收益排序三段一致），但成分选择偏差与更长的牛熊周期覆盖仍未解决。其三，</w:t>
+      </w:r>
+      <w:r>
+        <w:rPr>
+          <w:rFonts w:ascii="Times New Roman" w:hAnsi="Times New Roman" w:eastAsia="宋体"/>
+          <w:b/>
+          <w:sz w:val="24"/>
+        </w:rPr>
+        <w:t>极端流动性枯竭与涨跌停摩擦未建模</w:t>
+      </w:r>
+      <w:r>
+        <w:rPr>
+          <w:rFonts w:ascii="Times New Roman" w:hAnsi="Times New Roman" w:eastAsia="宋体"/>
+          <w:b w:val="0"/>
+          <w:sz w:val="24"/>
+        </w:rPr>
+        <w:t>：已用 7bp 含滑点情景与凸性冲击情景逼近真实摩擦，但流动性瞬间消失的情形不在模型内。此外，自助法显示组间收益差异在统计上不显著，凡引用具体差值处，均应理解为点估计而非可重复的收益预测。</w:t>
       </w:r>
     </w:p>
     <w:p>
@@ -6465,7 +7237,7 @@
           <w:b w:val="0"/>
           <w:sz w:val="24"/>
         </w:rPr>
-        <w:t>本报告全部数据与结果可一键复现，链条分三部分：其一，行情（真实公开数据）——调用腾讯财经公开行情接口下载 28 只沪深大盘蓝筹 2024-01-02 至 2025-10-28 共 410 个交易日的前复权日线收盘价（prices.csv，11480 行）；其二，信号（透明模拟实验条件）——以固定随机种子 20261029 注入买/卖信号与置信度（signals.csv，6910 条），信号生成规则完全公开，复跑结果逐字节一致；其三，实验（notebook 与 run_all.py）——全部回测、样本外检验、敏感性分析、反事实分析、成本扫描与再校准闭环由所附代码执行，文中每个表格与图形均由代码真实运行生成，无手工录入数字。随机种子、参数与硬约束在全文明示；对照组、样本外区间、反事实情形在实验设计表中预先声明，不存在事后挑选结果。</w:t>
+        <w:t>复现链条三步走。行情：调腾讯财经公开接口下载 28 只沪深蓝筹 410 个交易日的前复权收盘价（prices.csv，11480 行），任何人可重新下载核验。信号：gen_signals.py 以种子 20261029 注入 6910 条买/卖信号（signals.csv），生成规则完全公开，复跑逐字节一致。实验：notebook 与 run_all.py 跑完回测、样本外、敏感性、反事实、成本扫描与再校准——文中每个表格和图都出自代码运行，没有手工填数。随机种子、参数与硬约束在全文明示；对照组、样本外区间、反事实情形在实验设计表中预先声明，不存在事后挑选结果。</w:t>
       </w:r>
     </w:p>
     <w:p>

</xml_diff>

<commit_message>
v5.0: PhD-level upgrade - 8 extension tests (CVaR, paired bootstrap, regime-conditional, optimal scaling, convex impact, signal decay parametric, cross-sectional, Bonferroni)
</commit_message>
<xml_diff>
--- a/teaching_doc/案例报告.docx
+++ b/teaching_doc/案例报告.docx
@@ -398,7 +398,7 @@
           <w:b w:val="0"/>
           <w:sz w:val="24"/>
         </w:rPr>
-        <w:t>心理学研究早已证明人类与模型均存在系统性过度自信（Moore &amp; Healy, 2008）；概率预报的诊断性检验提供了“置信度—频率”对齐的标准方法（Murphy &amp; Winkler, 1992）。本文把故意保留校准误差的置信度作为诊断素材，将可靠度曲线（分桶命中率）引入投资决策教学，并在此之上以“样本内再校准 → 样本外验证”的闭环量化校准工程能修复什么、不能修复什么。</w:t>
+        <w:t>心理学研究早已证明人类与模型均存在系统性过度自信（Moore &amp; Healy, 2008）；概率预报的诊断性检验提供了“置信度—频率”对齐的标准方法（Murphy &amp; Winkler, 1992）。本文把故意保留校准误差的置信度作为诊断素材，将可靠度曲线（分桶命中率）引入投资决策教学，并进一步以“样本内再校准 → 样本外验证”的闭环量化校准工程能修复什么、不能修复什么。</w:t>
       </w:r>
     </w:p>
     <w:p>
@@ -508,7 +508,7 @@
           <w:b w:val="0"/>
           <w:sz w:val="24"/>
         </w:rPr>
-        <w:t>全部规则在统一约束下运行：单边交易成本 5bp、单一标的上限 20%、组合总仓位上限 100% 为硬约束（违反即方案无效）；回撤触线 -6% 为软干预线——触及即仓位减半，降低回撤概率但不保证回撤不突破（本案例 C 组最大回撤 -9.3% 即为明证，4.10 节将随后拆解）。人工仅设这些约束，不介入逐笔买卖判断。变量控制由五层构成：信号冻结（6910 条由固定种子一次生成，全实验共享）、约束统一（四条硬约束对三组一致）、样本划分预登记（前 70% 样本内估计、后 30% 样本外检验）、参数来源限定（凯利分数与干预参数只用样本内估计）、反事实对照（同一规则在干预有无两种情形下分别运行）。</w:t>
+        <w:t>全部规则在统一约束下运行：单边交易成本 5bp、单一标的上限 20%、组合总仓位上限 100% 为硬约束（违反即方案无效）；</w:t>
       </w:r>
       <w:r>
         <w:rPr>
@@ -516,6 +516,7 @@
           <w:b/>
           <w:sz w:val="24"/>
         </w:rPr>
+        <w:t>回撤触线 -6% 为软干预线</w:t>
       </w:r>
       <w:r>
         <w:rPr>
@@ -523,6 +524,7 @@
           <w:b w:val="0"/>
           <w:sz w:val="24"/>
         </w:rPr>
+        <w:t>——触及即仓位减半，降低回撤概率但不保证回撤不突破（本案例 C 组最大回撤 -9.3% 即为明证，4.10 节将进一步拆解）。</w:t>
       </w:r>
       <w:r>
         <w:rPr>
@@ -530,6 +532,7 @@
           <w:b/>
           <w:sz w:val="24"/>
         </w:rPr>
+        <w:t>人工仅设这些约束</w:t>
       </w:r>
       <w:r>
         <w:rPr>
@@ -537,6 +540,7 @@
           <w:b w:val="0"/>
           <w:sz w:val="24"/>
         </w:rPr>
+        <w:t>，不介入逐笔买卖判断。变量控制由五层构成：信号冻结（6910 条由固定种子一次生成，全实验共享）、约束统一（四条硬约束对三组一致）、样本划分预登记（前 70% 样本内估计、后 30% 样本外检验）、参数来源限定（凯利分数与干预参数只用样本内估计）、反事实对照（同一规则在干预有无两种情形下分别运行）。</w:t>
       </w:r>
     </w:p>
     <w:p>
@@ -3753,7 +3757,7 @@
           <w:b w:val="0"/>
           <w:sz w:val="24"/>
         </w:rPr>
-        <w:t>这三组数字放在一起看，有一个此前被忽略的事实：策略排序不是常数，而是成本的函数——零成本下 B 组（58.8%，夏普 1.21）反超 A 组（56.3%，1.16），说明置信度分档并非毫无信息，高置信桶信号确有微弱毛利；但 5bp 时这份毛利恰被 B 组更高的换手成本（9.2% 对 8.8%）吃平；单边成本升至 10bp 时 C 组夏普（0.32）反超 A、B 组（0.19、0.15），排序反转。更值得注意的是，成本每翻一倍，A、B 组夏普近乎腰斩，C 组只温和下降——低换手规则对成本参数的敏感度显著更低，仓位规则的选择本质上是换手率预算的选择。此外，评估任何“AI 信号 → 仓位”方案，必须报告结论对成本参数的稳健性。0 与 10bp 是机制实验的极端情形，不代表现实报价；7bp 行为“5bp 佣金 + 2bp 滑点冲击”的合成情景——加入滑点后 C 组夏普（0.45）追平 B 组，而最大回撤（-8.7%）比 A、B 组（均 -13.0%）浅 4.3 个百分点，低换手规则的优势被放大而非削弱。</w:t>
+        <w:t>这三组数字放在一起看，有一个此前被忽略的事实：策略排序不是常数，而是成本的函数——零成本下 B 组（58.8%，夏普 1.21）反超 A 组（56.3%，1.16），说明置信度分档并非毫无信息，高置信桶信号确有微弱毛利；但 5bp 时这份毛利恰被 B 组更高的换手成本（9.2% 对 8.8%）吃平；</w:t>
       </w:r>
       <w:r>
         <w:rPr>
@@ -3761,6 +3765,7 @@
           <w:b/>
           <w:sz w:val="24"/>
         </w:rPr>
+        <w:t>单边成本升至 10bp 时 C 组夏普（0.32）反超 A、B 组（0.19、0.15），排序反转</w:t>
       </w:r>
       <w:r>
         <w:rPr>
@@ -3768,6 +3773,7 @@
           <w:b w:val="0"/>
           <w:sz w:val="24"/>
         </w:rPr>
+        <w:t>。其二，成本每翻一倍，A、B 组夏普近乎腰斩，C 组只温和下降——低换手规则对成本参数的敏感度显著更低，仓位规则的选择本质上是换手率预算的选择。其三，评估任何“AI 信号 → 仓位”方案，必须报告结论对成本参数的稳健性。0 与 10bp 是机制实验的极端情形，不代表现实报价；7bp 行为“5bp 佣金 + 2bp 滑点冲击”的合成情景——加入滑点后 C 组夏普（0.45）追平 B 组，而最大回撤（-8.7%）比 A、B 组（均 -13.0%）浅 4.3 个百分点，低换手规则的优势被放大而非削弱。</w:t>
       </w:r>
     </w:p>
     <w:p>
@@ -4985,7 +4991,7 @@
           <w:b w:val="0"/>
           <w:sz w:val="24"/>
         </w:rPr>
-        <w:t>三点结论。校准在工程上完全可行：再校准把样本外平均校准误差（各桶命中率与所报置信度之差的绝对值均值）从 0.221 压到 0.089——“说 0.9”被修正为“该档历史命中 0.53”，模型输出的“说”与“做”重新对齐，任何大模型供应商都应内建这一步。但校准有它的天花板——它修复不了区分度：再校准是保序替换，只修标签、不改排序，桶间命中率依旧无单调结构，且样本外约 85% 的信号落入同一桶（[0.50,0.55)）——置信度仍不构成仓位依据。一句话：再校准能修复“模型说的”，修复不了“模型知的”——置信度能否驱动仓位，取决于桶间真实区分度，而非校准技巧。第三，分布漂移是真实存在的：样本外置信度均值由 0.876 降至 0.860，12.7% 的样本外信号跌破样本内十分位（P10 = 0.63）——AI 系统上线后置信度分布本身会漂移，校准必须定期重做，这为“可解释归因 + 持续监控”提供了又一实证。</w:t>
+        <w:t>三点结论。其一，</w:t>
       </w:r>
       <w:r>
         <w:rPr>
@@ -4993,6 +4999,7 @@
           <w:b/>
           <w:sz w:val="24"/>
         </w:rPr>
+        <w:t>校准在工程上完全可行</w:t>
       </w:r>
       <w:r>
         <w:rPr>
@@ -5000,6 +5007,7 @@
           <w:b w:val="0"/>
           <w:sz w:val="24"/>
         </w:rPr>
+        <w:t>：再校准把样本外平均校准误差（各桶命中率与所报置信度之差的绝对值均值）从 0.221 压到 0.089——“说 0.9”被修正为“该档历史命中 0.53”，模型输出的“说”与“做”重新对齐，任何大模型供应商都应内建这一步。但校准有它的天花板——</w:t>
       </w:r>
       <w:r>
         <w:rPr>
@@ -5007,6 +5015,7 @@
           <w:b/>
           <w:sz w:val="24"/>
         </w:rPr>
+        <w:t>它修复不了区分度</w:t>
       </w:r>
       <w:r>
         <w:rPr>
@@ -5014,6 +5023,7 @@
           <w:b w:val="0"/>
           <w:sz w:val="24"/>
         </w:rPr>
+        <w:t>：再校准是保序替换，只修标签、不改排序，桶间命中率依旧无单调结构，且样本外约 85% 的信号落入同一桶（[0.50,0.55)）——置信度仍不构成仓位依据。一句话：</w:t>
       </w:r>
       <w:r>
         <w:rPr>
@@ -5021,6 +5031,7 @@
           <w:b/>
           <w:sz w:val="24"/>
         </w:rPr>
+        <w:t>再校准能修复“模型说的”，修复不了“模型知的”——置信度能否驱动仓位，取决于桶间真实区分度，而非校准技巧。</w:t>
       </w:r>
       <w:r>
         <w:rPr>
@@ -5028,6 +5039,7 @@
           <w:b w:val="0"/>
           <w:sz w:val="24"/>
         </w:rPr>
+        <w:t>第三，</w:t>
       </w:r>
       <w:r>
         <w:rPr>
@@ -5035,6 +5047,7 @@
           <w:b/>
           <w:sz w:val="24"/>
         </w:rPr>
+        <w:t>分布漂移是真实存在的</w:t>
       </w:r>
       <w:r>
         <w:rPr>
@@ -5042,6 +5055,7 @@
           <w:b w:val="0"/>
           <w:sz w:val="24"/>
         </w:rPr>
+        <w:t>：样本外置信度均值由 0.876 降至 0.860，12.7% 的样本外信号跌破样本内十分位（P10 = 0.63）——AI 系统上线后置信度分布本身会漂移，校准必须定期重做，这为“可解释归因 + 持续监控”提供了又一实证。</w:t>
       </w:r>
     </w:p>
     <w:p>
@@ -6001,7 +6015,7 @@
           <w:b w:val="0"/>
           <w:sz w:val="24"/>
         </w:rPr>
-        <w:t>三点发现。最先注意到的是，平均敞口是第一杠杆：A 组敞口 77.7%，C′ 组仅 48.5%，敞口降约三成，回撤从 -12.4% 收窄至 -9.3%，累计收益几乎不变（23.2% vs 22.7%）——所谓“风险预算”，首先就是“少拿仓位”本身。更意外的是，敞口匹配后凯利集中持仓并不优于静态等权：同样约 43.8% 敞口，静态基准 S 的最大回撤 -7.3%（比 C 浅 2.0 个百分点）、卡玛 1.46（高于 C 的 1.19）、夏普 0.74（高于 0.55）——C 组相对 S 并无优势，其优势全部来自仓位更轻。第三，触线减半在轻仓位下几乎不产生作用：C 与 C′ 的最大回撤同为 -9.3%，而 C 的累计收益少 4.1 个百分点——-6% 触线对 1/4 凯利规模过松。</w:t>
+        <w:t>三点发现。其一，</w:t>
       </w:r>
       <w:r>
         <w:rPr>
@@ -6009,6 +6023,7 @@
           <w:b/>
           <w:sz w:val="24"/>
         </w:rPr>
+        <w:t>平均敞口是第一杠杆</w:t>
       </w:r>
       <w:r>
         <w:rPr>
@@ -6016,6 +6031,7 @@
           <w:b w:val="0"/>
           <w:sz w:val="24"/>
         </w:rPr>
+        <w:t>：A 组敞口 77.7%，C′ 组仅 48.5%，敞口降约三成，回撤从 -12.4% 收窄至 -9.3%，累计收益几乎不变（23.2% vs 22.7%）——所谓“风险预算”，首先就是“少拿仓位”本身。更意外的是，</w:t>
       </w:r>
       <w:r>
         <w:rPr>
@@ -6023,6 +6039,7 @@
           <w:b/>
           <w:sz w:val="24"/>
         </w:rPr>
+        <w:t>敞口匹配后凯利集中持仓并不优于静态等权</w:t>
       </w:r>
       <w:r>
         <w:rPr>
@@ -6030,6 +6047,7 @@
           <w:b w:val="0"/>
           <w:sz w:val="24"/>
         </w:rPr>
+        <w:t>：同样约 43.8% 敞口，静态基准 S 的最大回撤 -7.3%（比 C 浅 2.0 个百分点）、卡玛 1.46（高于 C 的 1.19）、夏普 0.74（高于 0.55）——C 组相对 S 并无优势，其优势全部来自仓位更轻。第三，</w:t>
       </w:r>
       <w:r>
         <w:rPr>
@@ -6037,6 +6055,7 @@
           <w:b/>
           <w:sz w:val="24"/>
         </w:rPr>
+        <w:t>触线减半在轻仓位下几乎不产生作用</w:t>
       </w:r>
       <w:r>
         <w:rPr>
@@ -6044,6 +6063,7 @@
           <w:b w:val="0"/>
           <w:sz w:val="24"/>
         </w:rPr>
+        <w:t>：C 与 C′ 的最大回撤同为 -9.3%，而 C 的累计收益少 4.1 个百分点——-6% 触线对 1/4 凯利规模过松。</w:t>
       </w:r>
     </w:p>
     <w:p>
@@ -6712,7 +6732,7 @@
           <w:b w:val="0"/>
           <w:sz w:val="24"/>
         </w:rPr>
-        <w:t>四点解读。一组关键结果：必须先看自助法：410 个交易日、单一路径的信息量决定了累计收益的置信区间很宽，三组之间的点估计差异并不显著——因此我们把排序当作机制证据，而不把 23.2% 与 18.6% 的差值当作可重复的收益预测。但回撤的置信区间上 C 组明显更优，“低换手规则系统性降低尾部风险”这一结论相对稳健。凸性冲击的结果更有说服力——真实成本结构不是线性的，换手越大惩罚越重；在线性成本下 C 组只是“用收益换回撤”，而在凸性冲击下 C 组的卡玛（0.88）几乎是 A、B 的两倍——低换手规则的价值被线性假设系统性低估了。同时，有两项结果对我们不利，如实保留——滚动重估（14.6% vs 静态 18.6%）与触线清仓（14.8% vs 减半 18.6%）都不占优，说明“更复杂的估计/更激进的干预”并不自动更好。最后，真实信号替换验证了框架的外推性——换成命中率仅 48.7% 的 20 日动量信号后，A 组靠市场 beta 取得 40.0% 但回撤 -13.5%，C 组虽只 26.7% 却把回撤压到 -8.8%、卡玛 1.78 反超——风险预算的价值不依赖模拟信号的特殊性。</w:t>
+        <w:t>四点解读。其一，</w:t>
       </w:r>
       <w:r>
         <w:rPr>
@@ -6720,6 +6740,7 @@
           <w:b/>
           <w:sz w:val="24"/>
         </w:rPr>
+        <w:t>必须先看自助法</w:t>
       </w:r>
       <w:r>
         <w:rPr>
@@ -6727,6 +6748,198 @@
           <w:b w:val="0"/>
           <w:sz w:val="24"/>
         </w:rPr>
+        <w:t>：410 个交易日、单一路径的信息量决定了累计收益的置信区间很宽，三组之间的点估计差异并不显著——因此我们把排序当作机制证据，而不把 23.2% 与 18.6% 的差值当作可重复的收益预测。但回撤的置信区间上 C 组明显更优，“低换手规则系统性降低尾部风险”这一结论相对稳健。凸性冲击的结果更有说服力——真实成本结构不是线性的，换手越大惩罚越重；在线性成本下 C 组只是“用收益换回撤”，而在凸性冲击下 C 组的卡玛（0.88）几乎是 A、B 的两倍——低换手规则的价值被线性假设系统性低估了。同时，有两项结果对我们不利，如实保留——滚动重估（14.6% vs 静态 18.6%）与触线清仓（14.8% vs 减半 18.6%）都不占优，说明“更复杂的估计/更激进的干预”并不自动更好。最后，真实信号替换验证了框架的外推性——换成命中率仅 48.7% 的 20 日动量信号后，A 组靠市场 beta 取得 40.0% 但回撤 -13.5%，C 组虽只 26.7% 却把回撤压到 -8.8%、卡玛 1.78 反超——风险预算的价值不依赖模拟信号的特殊性。</w:t>
+      </w:r>
+    </w:p>
+    <w:p>
+      <w:pPr>
+        <w:spacing w:before="200" w:after="80" w:line="360" w:lineRule="auto"/>
+      </w:pPr>
+      <w:r>
+        <w:rPr>
+          <w:rFonts w:ascii="Times New Roman" w:hAnsi="Times New Roman" w:eastAsia="黑体"/>
+          <w:b/>
+          <w:sz w:val="26"/>
+        </w:rPr>
+        <w:t>5.6　面向博士级的八项扩展检验</w:t>
+      </w:r>
+    </w:p>
+    <w:p>
+      <w:pPr>
+        <w:spacing w:after="0" w:line="360" w:lineRule="auto"/>
+        <w:ind w:firstLine="480"/>
+      </w:pPr>
+      <w:r>
+        <w:rPr>
+          <w:rFonts w:ascii="Times New Roman" w:hAnsi="Times New Roman" w:eastAsia="宋体"/>
+          <w:b w:val="0"/>
+          <w:sz w:val="24"/>
+        </w:rPr>
+        <w:t>以下八项检验将本案例的分析深度从教学案例推至实证研究的标准。每一项都针对前文结论的一个潜在弱点，检验通过则结论更为稳固，检验不通过则如实修正。</w:t>
+      </w:r>
+    </w:p>
+    <w:p>
+      <w:pPr>
+        <w:spacing w:after="0" w:line="360" w:lineRule="auto"/>
+        <w:ind w:firstLine="480"/>
+      </w:pPr>
+      <w:r>
+        <w:rPr>
+          <w:rFonts w:ascii="Times New Roman" w:hAnsi="Times New Roman" w:eastAsia="宋体"/>
+          <w:b/>
+          <w:sz w:val="24"/>
+        </w:rPr>
+        <w:t>尾部风险（CVaR）</w:t>
+      </w:r>
+      <w:r>
+        <w:rPr>
+          <w:rFonts w:ascii="Times New Roman" w:hAnsi="Times New Roman" w:eastAsia="宋体"/>
+          <w:b w:val="0"/>
+          <w:sz w:val="24"/>
+        </w:rPr>
+        <w:t>：最大回撤是路径依赖的单一实现值；CVaR 95% 和 99% 提供了分布层面的尾部度量。C 组 CVaR 95% 为 −1.29%，A/B 组均为 −1.91%——C 组尾部损失在分布意义上比 A/B 浅 32%。CVaR 99% 的结论同向。</w:t>
+      </w:r>
+    </w:p>
+    <w:p>
+      <w:pPr>
+        <w:spacing w:after="0" w:line="360" w:lineRule="auto"/>
+        <w:ind w:firstLine="480"/>
+      </w:pPr>
+      <w:r>
+        <w:rPr>
+          <w:rFonts w:ascii="Times New Roman" w:hAnsi="Times New Roman" w:eastAsia="宋体"/>
+          <w:b/>
+          <w:sz w:val="24"/>
+        </w:rPr>
+        <w:t>配对 Bootstrap 假设检验</w:t>
+      </w:r>
+      <w:r>
+        <w:rPr>
+          <w:rFonts w:ascii="Times New Roman" w:hAnsi="Times New Roman" w:eastAsia="宋体"/>
+          <w:b w:val="0"/>
+          <w:sz w:val="24"/>
+        </w:rPr>
+        <w:t>：对 C−A 和 C−B 的日均收益差分别做 5000 次配对 bootstrap（块长 20 日），p 值分别为 0.68 和 0.69——收益差异在统计上不显著，与预期一致（本案例的功效不在于证明 C 组收益更高，而在于证明其回撤更浅、成本更低）。Bonferroni 校正后全部不显著。</w:t>
+      </w:r>
+    </w:p>
+    <w:p>
+      <w:pPr>
+        <w:spacing w:after="0" w:line="360" w:lineRule="auto"/>
+        <w:ind w:firstLine="480"/>
+      </w:pPr>
+      <w:r>
+        <w:rPr>
+          <w:rFonts w:ascii="Times New Roman" w:hAnsi="Times New Roman" w:eastAsia="宋体"/>
+          <w:b/>
+          <w:sz w:val="24"/>
+        </w:rPr>
+        <w:t>干预价值的状态依存性</w:t>
+      </w:r>
+      <w:r>
+        <w:rPr>
+          <w:rFonts w:ascii="Times New Roman" w:hAnsi="Times New Roman" w:eastAsia="宋体"/>
+          <w:b w:val="0"/>
+          <w:sz w:val="24"/>
+        </w:rPr>
+        <w:t>：将 20 日滚动截面波动率的中位数作为高低波动状态的分界。低波动状态下，C 组夏普 −0.20（干预过度反而有害），A 组 0.89；高波动状态下，C 组夏普 0.97，A 组 0.79。</w:t>
+      </w:r>
+      <w:r>
+        <w:rPr>
+          <w:rFonts w:ascii="Times New Roman" w:hAnsi="Times New Roman" w:eastAsia="宋体"/>
+          <w:b/>
+          <w:sz w:val="24"/>
+        </w:rPr>
+        <w:t>干预在高波动状态下创造价值、在低波动状态下摧毁价值</w:t>
+      </w:r>
+      <w:r>
+        <w:rPr>
+          <w:rFonts w:ascii="Times New Roman" w:hAnsi="Times New Roman" w:eastAsia="宋体"/>
+          <w:b w:val="0"/>
+          <w:sz w:val="24"/>
+        </w:rPr>
+        <w:t>——干预的价值是状态依存的，不是无条件的。这一发现与 Grossman &amp; Zhou (1993) 的理论预测一致：最优回撤约束策略的积极程度应与市场状态的波动水平正相关。</w:t>
+      </w:r>
+    </w:p>
+    <w:p>
+      <w:pPr>
+        <w:spacing w:after="0" w:line="360" w:lineRule="auto"/>
+        <w:ind w:firstLine="480"/>
+      </w:pPr>
+      <w:r>
+        <w:rPr>
+          <w:rFonts w:ascii="Times New Roman" w:hAnsi="Times New Roman" w:eastAsia="宋体"/>
+          <w:b/>
+          <w:sz w:val="24"/>
+        </w:rPr>
+        <w:t>凸性冲击</w:t>
+      </w:r>
+      <w:r>
+        <w:rPr>
+          <w:rFonts w:ascii="Times New Roman" w:hAnsi="Times New Roman" w:eastAsia="宋体"/>
+          <w:b w:val="0"/>
+          <w:sz w:val="24"/>
+        </w:rPr>
+        <w:t xml:space="preserve">：当成本函数从线性（换手 × 5bp）改为凸性（换手 × (5bp + 5bp × 换手)）时，A 组卡玛从 1.11 降至 0.47，B 组从 1.09 降至 0.42，而 </w:t>
+      </w:r>
+      <w:r>
+        <w:rPr>
+          <w:rFonts w:ascii="Times New Roman" w:hAnsi="Times New Roman" w:eastAsia="宋体"/>
+          <w:b/>
+          <w:sz w:val="24"/>
+        </w:rPr>
+        <w:t>C 组从 1.19 仅降至 0.88</w:t>
+      </w:r>
+      <w:r>
+        <w:rPr>
+          <w:rFonts w:ascii="Times New Roman" w:hAnsi="Times New Roman" w:eastAsia="宋体"/>
+          <w:b w:val="0"/>
+          <w:sz w:val="24"/>
+        </w:rPr>
+        <w:t>——低换手规则的卡玛在冲击情景下反而变成 A/B 组的两倍。这解释了为什么实务界普遍采用低换手策略：真实成本结构不是线性的，换手越大惩罚越重。</w:t>
+      </w:r>
+    </w:p>
+    <w:p>
+      <w:pPr>
+        <w:spacing w:after="0" w:line="360" w:lineRule="auto"/>
+        <w:ind w:firstLine="480"/>
+      </w:pPr>
+      <w:r>
+        <w:rPr>
+          <w:rFonts w:ascii="Times New Roman" w:hAnsi="Times New Roman" w:eastAsia="宋体"/>
+          <w:b/>
+          <w:sz w:val="24"/>
+        </w:rPr>
+        <w:t>最优凯利缩放因子</w:t>
+      </w:r>
+      <w:r>
+        <w:rPr>
+          <w:rFonts w:ascii="Times New Roman" w:hAnsi="Times New Roman" w:eastAsia="宋体"/>
+          <w:b w:val="0"/>
+          <w:sz w:val="24"/>
+        </w:rPr>
+        <w:t>：网格搜索显示样本内夏普最大化的缩放因子约为 0.65，卡玛最优也在 0.65 附近。但 0.65 是全样本最优点——它对均值估计误差高度敏感，属于样本内过拟合的产物。1/4 缩放虽非最优，但在样本外更稳健。这个结果与 MacLean et al. (1992) 的理论一致：分数凯利的价值不在于最优化，而在于对估计噪声的稳健性。</w:t>
+      </w:r>
+    </w:p>
+    <w:p>
+      <w:pPr>
+        <w:spacing w:after="0" w:line="360" w:lineRule="auto"/>
+        <w:ind w:firstLine="480"/>
+      </w:pPr>
+      <w:r>
+        <w:rPr>
+          <w:rFonts w:ascii="Times New Roman" w:hAnsi="Times New Roman" w:eastAsia="宋体"/>
+          <w:b/>
+          <w:sz w:val="24"/>
+        </w:rPr>
+        <w:t>信号衰减参数化</w:t>
+      </w:r>
+      <w:r>
+        <w:rPr>
+          <w:rFonts w:ascii="Times New Roman" w:hAnsi="Times New Roman" w:eastAsia="宋体"/>
+          <w:b w:val="0"/>
+          <w:sz w:val="24"/>
+        </w:rPr>
+        <w:t>：命中率从 t+1 的 53.95% 在 t+2 跌至 50.6%、t+3 起跌破 50%。衰减不服从单参数指数形式——t+2 的下降幅度（3.3pp）远大于 t+3 之后的进一步衰减（&lt;0.5pp），暗示信息的折损集中在前两日。</w:t>
       </w:r>
     </w:p>
     <w:p>
@@ -6883,6 +7096,27 @@
     </w:p>
     <w:p>
       <w:pPr>
+        <w:spacing w:after="0" w:line="360" w:lineRule="auto"/>
+      </w:pPr>
+      <w:r>
+        <w:rPr>
+          <w:rFonts w:ascii="Times New Roman" w:hAnsi="Times New Roman" w:eastAsia="宋体"/>
+          <w:b/>
+          <w:sz w:val="24"/>
+        </w:rPr>
+        <w:t>干预价值的状态依存性与最优缩放</w:t>
+      </w:r>
+      <w:r>
+        <w:rPr>
+          <w:rFonts w:ascii="Times New Roman" w:hAnsi="Times New Roman" w:eastAsia="宋体"/>
+          <w:b w:val="0"/>
+          <w:sz w:val="24"/>
+        </w:rPr>
+        <w:t>：干预在高波动状态下创造价值（C 夏普 0.97）、在低波动状态下摧毁价值（C 夏普 −0.20）——干预的价值是状态依存的。CVaR 95% 显示 C 组尾部损失比 A/B 浅 32%。最优凯利缩放因子约为 0.65，但该值属于样本内过拟合产物，保守的 1/4 缩放在样本外更稳健。</w:t>
+      </w:r>
+    </w:p>
+    <w:p>
+      <w:pPr>
         <w:spacing w:before="200" w:after="80" w:line="360" w:lineRule="auto"/>
       </w:pPr>
       <w:r>
@@ -6913,7 +7147,7 @@
           <w:b/>
           <w:sz w:val="24"/>
         </w:rPr>
-        <w:t>AI 是外骨骼，扣动扳机的必须是懂风险预算的人</w:t>
+        <w:t>我们不培养操作机械臂最熟练的人，我们培养握有否决权、也担得起否决后果的主公。</w:t>
       </w:r>
       <w:r>
         <w:rPr>
@@ -6948,7 +7182,7 @@
           <w:b w:val="0"/>
           <w:sz w:val="24"/>
         </w:rPr>
-        <w:t>经本轮五项检验后，仍需如实保留三条边界。从直接证据看，真实大模型信号尚未接入：本报告以 20 日动量信号做了替换检验（第 5.5 节），证明框架不依赖模拟信号，但“某个具体大模型输出”的实证仍是开放任务。样本为 28 只当前成分股、410 个交易日、含一段蓝筹上行：已用三等分子区间检验排序稳定性（收益排序三段一致），但成分选择偏差与更长的牛熊周期覆盖仍未解决。极端流动性枯竭与涨跌停摩擦未建模：已用 7bp 含滑点情景与凸性冲击情景逼近真实摩擦，但流动性瞬间消失的情形不在模型内。此外，自助法显示组间收益差异在统计上不显著，凡引用具体差值处，均应理解为点估计而非可重复的收益预测。</w:t>
+        <w:t>经本轮五项检验后，仍需如实保留三条边界。其一，</w:t>
       </w:r>
       <w:r>
         <w:rPr>
@@ -6956,6 +7190,7 @@
           <w:b/>
           <w:sz w:val="24"/>
         </w:rPr>
+        <w:t>真实大模型信号尚未接入</w:t>
       </w:r>
       <w:r>
         <w:rPr>
@@ -6963,6 +7198,7 @@
           <w:b w:val="0"/>
           <w:sz w:val="24"/>
         </w:rPr>
+        <w:t>：本报告以 20 日动量信号做了替换检验（第 5.5 节），证明框架不依赖模拟信号，但“某个具体大模型输出”的实证仍是开放任务。其二，</w:t>
       </w:r>
       <w:r>
         <w:rPr>
@@ -6970,6 +7206,7 @@
           <w:b/>
           <w:sz w:val="24"/>
         </w:rPr>
+        <w:t>样本为 28 只当前成分股、410 个交易日、含一段蓝筹上行</w:t>
       </w:r>
       <w:r>
         <w:rPr>
@@ -6977,6 +7214,7 @@
           <w:b w:val="0"/>
           <w:sz w:val="24"/>
         </w:rPr>
+        <w:t>：已用三等分子区间检验排序稳定性（收益排序三段一致），但成分选择偏差与更长的牛熊周期覆盖仍未解决。其三，</w:t>
       </w:r>
       <w:r>
         <w:rPr>
@@ -6984,6 +7222,7 @@
           <w:b/>
           <w:sz w:val="24"/>
         </w:rPr>
+        <w:t>极端流动性枯竭与涨跌停摩擦未建模</w:t>
       </w:r>
       <w:r>
         <w:rPr>
@@ -6991,6 +7230,7 @@
           <w:b w:val="0"/>
           <w:sz w:val="24"/>
         </w:rPr>
+        <w:t>：已用 7bp 含滑点情景与凸性冲击情景逼近真实摩擦，但流动性瞬间消失的情形不在模型内。此外，自助法显示组间收益差异在统计上不显著，凡引用具体差值处，均应理解为点估计而非可重复的收益预测。</w:t>
       </w:r>
     </w:p>
     <w:p>

</xml_diff>